<commit_message>
docs: restituye la reproducibilidad y dos detalles al informe de la S2
Al rehacer el informe con la estructura del ejemplo se perdio el apartado de
reproducibilidad, que esa estructura no contempla, y dos precisiones al
reescribir la prosa. Se devuelven sin salirse de las siete paginas.

- 6.1 Reproducibilidad: como se regeneran las cifras, la semilla y que
  contiene el repositorio
- la distancia del valor observado a la distribucion nula, en desviaciones
  tipicas
- que la coincidencia entre percentil y BCa implica estimadores insesgados

El informe queda con mas texto que la version anterior a esta alineacion
-2.808 palabras frente a 2.413- en una pagina menos, porque el formato del
ejemplo es mas compacto.

Co-authored-by: María Fassler Neumann <m.fasslerneumann@uandresbello.edu>
</commit_message>
<xml_diff>
--- a/S2/informe/Sumativa2_Informe_Maria_Fassler_Sebastian_Antunez.docx
+++ b/S2/informe/Sumativa2_Informe_Maria_Fassler_Sebastian_Antunez.docx
@@ -12,7 +12,7 @@
           <w:noProof/>
         </w:rPr>
         <w:drawing>
-          <wp:inline distT="0" distB="0" distL="0" distR="0" wp14:anchorId="69186CDE" wp14:editId="69157995">
+          <wp:inline distT="0" distB="0" distL="0" distR="0" wp14:anchorId="208A3D5D" wp14:editId="7260E8E1">
             <wp:extent cx="990600" cy="990600"/>
             <wp:effectExtent l="0" t="0" r="0" b="0"/>
             <wp:docPr id="1" name="Picture 1"/>
@@ -776,7 +776,7 @@
     <w:sdt>
       <w:sdtPr>
         <w:alias w:val="Indice"/>
-        <w:id w:val="1559441845"/>
+        <w:id w:val="-446858611"/>
       </w:sdtPr>
       <w:sdtEndPr/>
       <w:sdtContent>
@@ -799,7 +799,7 @@
           <w:r>
             <w:fldChar w:fldCharType="separate"/>
           </w:r>
-          <w:hyperlink w:anchor="_Toc242820284" w:history="1">
+          <w:hyperlink w:anchor="_Toc242820883" w:history="1">
             <w:r>
               <w:rPr>
                 <w:rStyle w:val="Hyperlink"/>
@@ -825,7 +825,7 @@
               <w:rPr>
                 <w:noProof/>
               </w:rPr>
-              <w:instrText xml:space="preserve"> PAGEREF _Toc242820284 \h </w:instrText>
+              <w:instrText xml:space="preserve"> PAGEREF _Toc242820883 \h </w:instrText>
             </w:r>
             <w:r>
               <w:rPr>
@@ -862,7 +862,7 @@
               <w:noProof/>
             </w:rPr>
           </w:pPr>
-          <w:hyperlink w:anchor="_Toc242820285" w:history="1">
+          <w:hyperlink w:anchor="_Toc242820884" w:history="1">
             <w:r>
               <w:rPr>
                 <w:rStyle w:val="Hyperlink"/>
@@ -888,7 +888,7 @@
               <w:rPr>
                 <w:noProof/>
               </w:rPr>
-              <w:instrText xml:space="preserve"> PAGEREF _Toc242820285 \h </w:instrText>
+              <w:instrText xml:space="preserve"> PAGEREF _Toc242820884 \h </w:instrText>
             </w:r>
             <w:r>
               <w:rPr>
@@ -925,7 +925,7 @@
               <w:noProof/>
             </w:rPr>
           </w:pPr>
-          <w:hyperlink w:anchor="_Toc242820286" w:history="1">
+          <w:hyperlink w:anchor="_Toc242820885" w:history="1">
             <w:r>
               <w:rPr>
                 <w:rStyle w:val="Hyperlink"/>
@@ -951,7 +951,7 @@
               <w:rPr>
                 <w:noProof/>
               </w:rPr>
-              <w:instrText xml:space="preserve"> PAGEREF _Toc242820286 \h </w:instrText>
+              <w:instrText xml:space="preserve"> PAGEREF _Toc242820885 \h </w:instrText>
             </w:r>
             <w:r>
               <w:rPr>
@@ -988,7 +988,7 @@
               <w:noProof/>
             </w:rPr>
           </w:pPr>
-          <w:hyperlink w:anchor="_Toc242820287" w:history="1">
+          <w:hyperlink w:anchor="_Toc242820886" w:history="1">
             <w:r>
               <w:rPr>
                 <w:rStyle w:val="Hyperlink"/>
@@ -1014,7 +1014,7 @@
               <w:rPr>
                 <w:noProof/>
               </w:rPr>
-              <w:instrText xml:space="preserve"> PAGEREF _Toc242820287 \h </w:instrText>
+              <w:instrText xml:space="preserve"> PAGEREF _Toc242820886 \h </w:instrText>
             </w:r>
             <w:r>
               <w:rPr>
@@ -1051,7 +1051,7 @@
               <w:noProof/>
             </w:rPr>
           </w:pPr>
-          <w:hyperlink w:anchor="_Toc242820288" w:history="1">
+          <w:hyperlink w:anchor="_Toc242820887" w:history="1">
             <w:r>
               <w:rPr>
                 <w:rStyle w:val="Hyperlink"/>
@@ -1077,7 +1077,7 @@
               <w:rPr>
                 <w:noProof/>
               </w:rPr>
-              <w:instrText xml:space="preserve"> PAGEREF _Toc242820288 \h </w:instrText>
+              <w:instrText xml:space="preserve"> PAGEREF _Toc242820887 \h </w:instrText>
             </w:r>
             <w:r>
               <w:rPr>
@@ -1114,7 +1114,7 @@
               <w:noProof/>
             </w:rPr>
           </w:pPr>
-          <w:hyperlink w:anchor="_Toc242820289" w:history="1">
+          <w:hyperlink w:anchor="_Toc242820888" w:history="1">
             <w:r>
               <w:rPr>
                 <w:rStyle w:val="Hyperlink"/>
@@ -1140,7 +1140,7 @@
               <w:rPr>
                 <w:noProof/>
               </w:rPr>
-              <w:instrText xml:space="preserve"> PAGEREF _Toc242820289 \h </w:instrText>
+              <w:instrText xml:space="preserve"> PAGEREF _Toc242820888 \h </w:instrText>
             </w:r>
             <w:r>
               <w:rPr>
@@ -1158,6 +1158,69 @@
                 <w:noProof/>
               </w:rPr>
               <w:t>6</w:t>
+            </w:r>
+            <w:r>
+              <w:rPr>
+                <w:noProof/>
+              </w:rPr>
+              <w:fldChar w:fldCharType="end"/>
+            </w:r>
+          </w:hyperlink>
+        </w:p>
+        <w:p>
+          <w:pPr>
+            <w:pStyle w:val="TOC2"/>
+            <w:tabs>
+              <w:tab w:val="right" w:leader="dot" w:pos="9964"/>
+            </w:tabs>
+            <w:rPr>
+              <w:noProof/>
+            </w:rPr>
+          </w:pPr>
+          <w:hyperlink w:anchor="_Toc242820889" w:history="1">
+            <w:r>
+              <w:rPr>
+                <w:rStyle w:val="Hyperlink"/>
+                <w:b/>
+                <w:bCs/>
+                <w:noProof/>
+              </w:rPr>
+              <w:t>6.1 Reproducibilidad</w:t>
+            </w:r>
+            <w:r>
+              <w:rPr>
+                <w:noProof/>
+              </w:rPr>
+              <w:tab/>
+            </w:r>
+            <w:r>
+              <w:rPr>
+                <w:noProof/>
+              </w:rPr>
+              <w:fldChar w:fldCharType="begin"/>
+            </w:r>
+            <w:r>
+              <w:rPr>
+                <w:noProof/>
+              </w:rPr>
+              <w:instrText xml:space="preserve"> PAGEREF _Toc242820889 \h </w:instrText>
+            </w:r>
+            <w:r>
+              <w:rPr>
+                <w:noProof/>
+              </w:rPr>
+            </w:r>
+            <w:r>
+              <w:rPr>
+                <w:noProof/>
+              </w:rPr>
+              <w:fldChar w:fldCharType="separate"/>
+            </w:r>
+            <w:r>
+              <w:rPr>
+                <w:noProof/>
+              </w:rPr>
+              <w:t>7</w:t>
             </w:r>
             <w:r>
               <w:rPr>
@@ -1177,7 +1240,7 @@
               <w:noProof/>
             </w:rPr>
           </w:pPr>
-          <w:hyperlink w:anchor="_Toc242820290" w:history="1">
+          <w:hyperlink w:anchor="_Toc242820890" w:history="1">
             <w:r>
               <w:rPr>
                 <w:rStyle w:val="Hyperlink"/>
@@ -1203,7 +1266,7 @@
               <w:rPr>
                 <w:noProof/>
               </w:rPr>
-              <w:instrText xml:space="preserve"> PAGEREF _Toc242820290 \h </w:instrText>
+              <w:instrText xml:space="preserve"> PAGEREF _Toc242820890 \h </w:instrText>
             </w:r>
             <w:r>
               <w:rPr>
@@ -1253,7 +1316,7 @@
         <w:pStyle w:val="Heading1"/>
         <w:spacing w:before="230" w:after="60"/>
       </w:pPr>
-      <w:bookmarkStart w:id="0" w:name="_Toc242820284"/>
+      <w:bookmarkStart w:id="0" w:name="_Toc242820883"/>
       <w:r>
         <w:rPr>
           <w:b/>
@@ -1992,7 +2055,7 @@
           <w:noProof/>
         </w:rPr>
         <w:drawing>
-          <wp:inline distT="0" distB="0" distL="0" distR="0" wp14:anchorId="77E62969" wp14:editId="53CF8AA5">
+          <wp:inline distT="0" distB="0" distL="0" distR="0" wp14:anchorId="0AD3069D" wp14:editId="5CB166B6">
             <wp:extent cx="4464558" cy="2831771"/>
             <wp:effectExtent l="0" t="0" r="0" b="0"/>
             <wp:docPr id="2" name="Picture 2"/>
@@ -2060,7 +2123,17 @@
         <w:t>Los factores de corrección son próximos a cero en los cuatro casos</w:t>
       </w:r>
       <w:r>
-        <w:t>: z₀ varía entre −0,015 y +0,017, y a entre −0,0003 y +0,0020. En consecuencia el BCa apenas se desplaza respecto del percentil —como máximo 0,0016 en la edad media— y los tres intervalos se superponen, con discrepancias de amplitud inferiores al 0,9 %.</w:t>
+        <w:t xml:space="preserve">: z₀ varía entre −0,015 y +0,017, y a entre −0,0003 y +0,0020. En consecuencia el BCa apenas se desplaza respecto del percentil —como máximo 0,0016 en la edad media— y los tres intervalos se superponen, con discrepancias de amplitud inferiores al 0,9 %. Que percentil y BCa coincidan indica además que </w:t>
+      </w:r>
+      <w:r>
+        <w:rPr>
+          <w:b/>
+          <w:bCs/>
+        </w:rPr>
+        <w:t>los estimadores son insesgados en la práctica</w:t>
+      </w:r>
+      <w:r>
+        <w:t xml:space="preserve"> y que su distribución no está torcida.</w:t>
       </w:r>
     </w:p>
     <w:p>
@@ -2103,7 +2176,7 @@
         <w:pStyle w:val="Heading1"/>
         <w:spacing w:before="230" w:after="60"/>
       </w:pPr>
-      <w:bookmarkStart w:id="1" w:name="_Toc242820285"/>
+      <w:bookmarkStart w:id="1" w:name="_Toc242820884"/>
       <w:r>
         <w:rPr>
           <w:b/>
@@ -2129,6 +2202,7 @@
           <w:sz w:val="15"/>
           <w:szCs w:val="15"/>
         </w:rPr>
+        <w:lastRenderedPageBreak/>
         <w:t>(15 pts) Seleccionen al menos una prueba de S1; implementen un test de permutación (≥10.000 permutaciones); comparen el valor p de permutación con el paramétrico original y discutan la concordancia entre ambos enfoques.</w:t>
       </w:r>
     </w:p>
@@ -2138,7 +2212,6 @@
         <w:jc w:val="both"/>
       </w:pPr>
       <w:r>
-        <w:lastRenderedPageBreak/>
         <w:t xml:space="preserve">Validamos la </w:t>
       </w:r>
       <w:r>
@@ -2171,7 +2244,7 @@
           <w:noProof/>
         </w:rPr>
         <w:drawing>
-          <wp:inline distT="0" distB="0" distL="0" distR="0" wp14:anchorId="5C06AC30" wp14:editId="07089BE3">
+          <wp:inline distT="0" distB="0" distL="0" distR="0" wp14:anchorId="1CBE3E5E" wp14:editId="496B655A">
             <wp:extent cx="4104513" cy="2433950"/>
             <wp:effectExtent l="0" t="0" r="0" b="0"/>
             <wp:docPr id="3" name="Picture 3"/>
@@ -2252,7 +2325,17 @@
         <w:t>ninguna de las 10.000 permutaciones se acerca al valor observado</w:t>
       </w:r>
       <w:r>
-        <w:t>, de modo que el valor p de permutación es 0,0002, el mínimo que el procedimiento puede devolver en un contraste bilateral.</w:t>
+        <w:t xml:space="preserve">, de modo que el valor p de permutación es 0,0002, el mínimo que el procedimiento puede devolver en un contraste bilateral. La distancia es de </w:t>
+      </w:r>
+      <w:r>
+        <w:rPr>
+          <w:b/>
+          <w:bCs/>
+        </w:rPr>
+        <w:t>más de veinte desviaciones típicas</w:t>
+      </w:r>
+      <w:r>
+        <w:t xml:space="preserve"> de la distribución nula.</w:t>
       </w:r>
     </w:p>
     <w:p>
@@ -2279,7 +2362,7 @@
         <w:pStyle w:val="Heading1"/>
         <w:spacing w:before="230" w:after="60"/>
       </w:pPr>
-      <w:bookmarkStart w:id="2" w:name="_Toc242820286"/>
+      <w:bookmarkStart w:id="2" w:name="_Toc242820885"/>
       <w:r>
         <w:rPr>
           <w:b/>
@@ -3141,7 +3224,7 @@
         </w:rPr>
         <w:lastRenderedPageBreak/>
         <w:drawing>
-          <wp:inline distT="0" distB="0" distL="0" distR="0" wp14:anchorId="7050FCE6" wp14:editId="6E02EE8D">
+          <wp:inline distT="0" distB="0" distL="0" distR="0" wp14:anchorId="381C194B" wp14:editId="290325CB">
             <wp:extent cx="4608576" cy="1959712"/>
             <wp:effectExtent l="0" t="0" r="0" b="0"/>
             <wp:docPr id="4" name="Picture 4"/>
@@ -3230,7 +3313,7 @@
         <w:pStyle w:val="Heading1"/>
         <w:spacing w:before="230" w:after="60"/>
       </w:pPr>
-      <w:bookmarkStart w:id="3" w:name="_Toc242820287"/>
+      <w:bookmarkStart w:id="3" w:name="_Toc242820886"/>
       <w:r>
         <w:rPr>
           <w:b/>
@@ -3853,7 +3936,7 @@
           <w:noProof/>
         </w:rPr>
         <w:drawing>
-          <wp:inline distT="0" distB="0" distL="0" distR="0" wp14:anchorId="01867FC0" wp14:editId="1FDFAB37">
+          <wp:inline distT="0" distB="0" distL="0" distR="0" wp14:anchorId="78CDA486" wp14:editId="042DA956">
             <wp:extent cx="4464558" cy="1772431"/>
             <wp:effectExtent l="0" t="0" r="0" b="0"/>
             <wp:docPr id="5" name="Picture 5"/>
@@ -3968,7 +4051,7 @@
         <w:pStyle w:val="Heading1"/>
         <w:spacing w:before="230" w:after="60"/>
       </w:pPr>
-      <w:bookmarkStart w:id="4" w:name="_Toc242820288"/>
+      <w:bookmarkStart w:id="4" w:name="_Toc242820887"/>
       <w:r>
         <w:rPr>
           <w:b/>
@@ -4774,7 +4857,7 @@
         <w:pStyle w:val="Heading1"/>
         <w:spacing w:before="230" w:after="60"/>
       </w:pPr>
-      <w:bookmarkStart w:id="5" w:name="_Toc242820289"/>
+      <w:bookmarkStart w:id="5" w:name="_Toc242820888"/>
       <w:r>
         <w:rPr>
           <w:b/>
@@ -5396,10 +5479,81 @@
     </w:p>
     <w:p>
       <w:pPr>
+        <w:pStyle w:val="Heading2"/>
+        <w:spacing w:before="150" w:after="70"/>
+      </w:pPr>
+      <w:bookmarkStart w:id="6" w:name="_Toc242820889"/>
+      <w:r>
+        <w:rPr>
+          <w:b/>
+          <w:bCs/>
+          <w:color w:val="2E5496"/>
+          <w:sz w:val="21"/>
+          <w:szCs w:val="21"/>
+        </w:rPr>
+        <w:t>6.1 Reproducibilidad</w:t>
+      </w:r>
+      <w:bookmarkEnd w:id="6"/>
+    </w:p>
+    <w:p>
+      <w:pPr>
+        <w:spacing w:after="100" w:line="252" w:lineRule="auto"/>
+        <w:jc w:val="both"/>
+      </w:pPr>
+      <w:r>
+        <w:t xml:space="preserve">Todas las cifras de este informe se generan al ejecutar </w:t>
+      </w:r>
+      <w:r>
+        <w:rPr>
+          <w:rFonts w:ascii="Consolas" w:eastAsia="Consolas" w:hAnsi="Consolas" w:cs="Consolas"/>
+          <w:sz w:val="17"/>
+          <w:szCs w:val="17"/>
+        </w:rPr>
+        <w:t>S2/Sumativa2_Validacion_Remuestreo.ipynb</w:t>
+      </w:r>
+      <w:r>
+        <w:t xml:space="preserve">, que corre de principio a fin sin errores en poco más de un minuto y deja sus salidas en </w:t>
+      </w:r>
+      <w:r>
+        <w:rPr>
+          <w:rFonts w:ascii="Consolas" w:eastAsia="Consolas" w:hAnsi="Consolas" w:cs="Consolas"/>
+          <w:sz w:val="17"/>
+          <w:szCs w:val="17"/>
+        </w:rPr>
+        <w:t>S2/resultados/</w:t>
+      </w:r>
+      <w:r>
+        <w:t xml:space="preserve">. Cada procedimiento emplea 10.000 repeticiones y la semilla fijada en 42, de modo que los resultados son reproducibles hasta la última cifra. El repositorio contiene las carpetas </w:t>
+      </w:r>
+      <w:r>
+        <w:rPr>
+          <w:rFonts w:ascii="Consolas" w:eastAsia="Consolas" w:hAnsi="Consolas" w:cs="Consolas"/>
+          <w:sz w:val="17"/>
+          <w:szCs w:val="17"/>
+        </w:rPr>
+        <w:t>S1</w:t>
+      </w:r>
+      <w:r>
+        <w:t xml:space="preserve"> y </w:t>
+      </w:r>
+      <w:r>
+        <w:rPr>
+          <w:rFonts w:ascii="Consolas" w:eastAsia="Consolas" w:hAnsi="Consolas" w:cs="Consolas"/>
+          <w:sz w:val="17"/>
+          <w:szCs w:val="17"/>
+        </w:rPr>
+        <w:t>S2</w:t>
+      </w:r>
+      <w:r>
+        <w:t xml:space="preserve"> con los entregables de cada fase, el conjunto analítico versionado y los scripts que lo construyeron a partir de las bases del SIES.</w:t>
+      </w:r>
+    </w:p>
+    <w:p>
+      <w:pPr>
         <w:pStyle w:val="Heading1"/>
         <w:spacing w:before="230" w:after="60"/>
       </w:pPr>
-      <w:bookmarkStart w:id="6" w:name="_Toc242820290"/>
+      <w:bookmarkStart w:id="7" w:name="_Toc242820890"/>
       <w:r>
         <w:rPr>
           <w:b/>
@@ -5410,7 +5564,7 @@
         </w:rPr>
         <w:t>7. Bibliografía</w:t>
       </w:r>
-      <w:bookmarkEnd w:id="6"/>
+      <w:bookmarkEnd w:id="7"/>
     </w:p>
     <w:p>
       <w:pPr>
@@ -5718,10 +5872,10 @@
 <file path=word/numbering.xml><?xml version="1.0" encoding="utf-8"?>
 <w:numbering xmlns:wpc="http://schemas.microsoft.com/office/word/2010/wordprocessingCanvas" xmlns:cx="http://schemas.microsoft.com/office/drawing/2014/chartex" xmlns:cx1="http://schemas.microsoft.com/office/drawing/2015/9/8/chartex" xmlns:cx2="http://schemas.microsoft.com/office/drawing/2015/10/21/chartex" xmlns:cx3="http://schemas.microsoft.com/office/drawing/2016/5/9/chartex" xmlns:cx4="http://schemas.microsoft.com/office/drawing/2016/5/10/chartex" xmlns:cx5="http://schemas.microsoft.com/office/drawing/2016/5/11/chartex" xmlns:cx6="http://schemas.microsoft.com/office/drawing/2016/5/12/chartex" xmlns:cx7="http://schemas.microsoft.com/office/drawing/2016/5/13/chartex" xmlns:cx8="http://schemas.microsoft.com/office/drawing/2016/5/14/chartex" xmlns:mc="http://schemas.openxmlformats.org/markup-compatibility/2006" xmlns:aink="http://schemas.microsoft.com/office/drawing/2016/ink" xmlns:am3d="http://schemas.microsoft.com/office/drawing/2017/model3d" xmlns:o="urn:schemas-microsoft-com:office:office" xmlns:oel="http://schemas.microsoft.com/office/2019/extlst" xmlns:r="http://schemas.openxmlformats.org/officeDocument/2006/relationships" xmlns:m="http://schemas.openxmlformats.org/officeDocument/2006/math" xmlns:v="urn:schemas-microsoft-com:vml" xmlns:wp14="http://schemas.microsoft.com/office/word/2010/wordprocessingDrawing" xmlns:wp="http://schemas.openxmlformats.org/drawingml/2006/wordprocessingDrawing" xmlns:w10="urn:schemas-microsoft-com:office:word" xmlns:w="http://schemas.openxmlformats.org/wordprocessingml/2006/main" xmlns:w14="http://schemas.microsoft.com/office/word/2010/wordml" xmlns:w15="http://schemas.microsoft.com/office/word/2012/wordml" xmlns:w16cex="http://schemas.microsoft.com/office/word/2018/wordml/cex" xmlns:w16cid="http://schemas.microsoft.com/office/word/2016/wordml/cid" xmlns:w16="http://schemas.microsoft.com/office/word/2018/wordml" xmlns:w16sdtdh="http://schemas.microsoft.com/office/word/2020/wordml/sdtdatahash" xmlns:w16se="http://schemas.microsoft.com/office/word/2015/wordml/symex" xmlns:wpg="http://schemas.microsoft.com/office/word/2010/wordprocessingGroup" xmlns:wpi="http://schemas.microsoft.com/office/word/2010/wordprocessingInk" xmlns:wne="http://schemas.microsoft.com/office/word/2006/wordml" xmlns:wps="http://schemas.microsoft.com/office/word/2010/wordprocessingShape" mc:Ignorable="w14 w15 w16se w16cid w16 w16cex w16sdtdh wp14">
   <w:abstractNum w:abstractNumId="0" w15:restartNumberingAfterBreak="0">
-    <w:nsid w:val="2FE9400B"/>
+    <w:nsid w:val="6C6A7B9D"/>
     <w:multiLevelType w:val="hybridMultilevel"/>
-    <w:tmpl w:val="55BA28F8"/>
-    <w:lvl w:ilvl="0" w:tplc="1E02BADE" w:tentative="1">
+    <w:tmpl w:val="20140B12"/>
+    <w:lvl w:ilvl="0" w:tplc="FBEE68E6" w:tentative="1">
       <w:start w:val="1"/>
       <w:numFmt w:val="bullet"/>
       <w:lvlText w:val="●"/>
@@ -5730,7 +5884,7 @@
         <w:ind w:left="720" w:hanging="360"/>
       </w:pPr>
     </w:lvl>
-    <w:lvl w:ilvl="1" w:tplc="4ED829CC" w:tentative="1">
+    <w:lvl w:ilvl="1" w:tplc="DAC8ED46" w:tentative="1">
       <w:start w:val="1"/>
       <w:numFmt w:val="bullet"/>
       <w:lvlText w:val="○"/>
@@ -5739,7 +5893,7 @@
         <w:ind w:left="1440" w:hanging="360"/>
       </w:pPr>
     </w:lvl>
-    <w:lvl w:ilvl="2" w:tplc="E84ADC3A" w:tentative="1">
+    <w:lvl w:ilvl="2" w:tplc="5FB4F97A" w:tentative="1">
       <w:start w:val="1"/>
       <w:numFmt w:val="bullet"/>
       <w:lvlText w:val="■"/>
@@ -5748,7 +5902,7 @@
         <w:ind w:left="2160" w:hanging="360"/>
       </w:pPr>
     </w:lvl>
-    <w:lvl w:ilvl="3" w:tplc="35A4515E" w:tentative="1">
+    <w:lvl w:ilvl="3" w:tplc="50BE150E" w:tentative="1">
       <w:start w:val="1"/>
       <w:numFmt w:val="bullet"/>
       <w:lvlText w:val="●"/>
@@ -5757,7 +5911,7 @@
         <w:ind w:left="2880" w:hanging="360"/>
       </w:pPr>
     </w:lvl>
-    <w:lvl w:ilvl="4" w:tplc="E5964614" w:tentative="1">
+    <w:lvl w:ilvl="4" w:tplc="068A2FF6" w:tentative="1">
       <w:start w:val="1"/>
       <w:numFmt w:val="bullet"/>
       <w:lvlText w:val="○"/>
@@ -5766,7 +5920,7 @@
         <w:ind w:left="3600" w:hanging="360"/>
       </w:pPr>
     </w:lvl>
-    <w:lvl w:ilvl="5" w:tplc="C630BB6A" w:tentative="1">
+    <w:lvl w:ilvl="5" w:tplc="72EAE92E" w:tentative="1">
       <w:start w:val="1"/>
       <w:numFmt w:val="bullet"/>
       <w:lvlText w:val="■"/>
@@ -5775,7 +5929,7 @@
         <w:ind w:left="4320" w:hanging="360"/>
       </w:pPr>
     </w:lvl>
-    <w:lvl w:ilvl="6" w:tplc="6C1A90F2" w:tentative="1">
+    <w:lvl w:ilvl="6" w:tplc="2F38C1A4" w:tentative="1">
       <w:start w:val="1"/>
       <w:numFmt w:val="bullet"/>
       <w:lvlText w:val="●"/>
@@ -5784,7 +5938,7 @@
         <w:ind w:left="5040" w:hanging="360"/>
       </w:pPr>
     </w:lvl>
-    <w:lvl w:ilvl="7" w:tplc="311C5E04" w:tentative="1">
+    <w:lvl w:ilvl="7" w:tplc="43EE896E" w:tentative="1">
       <w:start w:val="1"/>
       <w:numFmt w:val="bullet"/>
       <w:lvlText w:val="●"/>
@@ -5793,7 +5947,7 @@
         <w:ind w:left="5760" w:hanging="360"/>
       </w:pPr>
     </w:lvl>
-    <w:lvl w:ilvl="8" w:tplc="2C30725C" w:tentative="1">
+    <w:lvl w:ilvl="8" w:tplc="D084D2C2" w:tentative="1">
       <w:start w:val="1"/>
       <w:numFmt w:val="bullet"/>
       <w:lvlText w:val="●"/>
@@ -5803,7 +5957,7 @@
       </w:pPr>
     </w:lvl>
   </w:abstractNum>
-  <w:num w:numId="1" w16cid:durableId="1728721032">
+  <w:num w:numId="1" w16cid:durableId="50227589">
     <w:abstractNumId w:val="0"/>
     <w:lvlOverride w:ilvl="0">
       <w:startOverride w:val="1"/>
@@ -6225,7 +6379,6 @@
     <w:basedOn w:val="Normal"/>
     <w:next w:val="Normal"/>
     <w:uiPriority w:val="9"/>
-    <w:semiHidden/>
     <w:unhideWhenUsed/>
     <w:qFormat/>
     <w:pPr>
@@ -6426,9 +6579,22 @@
     <w:autoRedefine/>
     <w:uiPriority w:val="39"/>
     <w:unhideWhenUsed/>
-    <w:rsid w:val="00D469B9"/>
+    <w:rsid w:val="00597EFB"/>
     <w:pPr>
       <w:spacing w:after="100"/>
+    </w:pPr>
+  </w:style>
+  <w:style w:type="paragraph" w:styleId="TOC2">
+    <w:name w:val="toc 2"/>
+    <w:basedOn w:val="Normal"/>
+    <w:next w:val="Normal"/>
+    <w:autoRedefine/>
+    <w:uiPriority w:val="39"/>
+    <w:unhideWhenUsed/>
+    <w:rsid w:val="00597EFB"/>
+    <w:pPr>
+      <w:spacing w:after="100"/>
+      <w:ind w:left="200"/>
     </w:pPr>
   </w:style>
 </w:styles>

</xml_diff>

<commit_message>
docs: revision de redaccion del informe de la S2
Reescritura de veinte parrafos a lo largo de los seis apartados. La
estructura, las tablas, las figuras y todas las cifras se conservan; cambia
la forma de exponerlas.

Varias precisiones mejoran el texto anterior:

- la ventaja de la estrategia B se enuncia ahora «bajo los supuestos de la
  simulacion», en vez de afirmarla sin condicionar
- la independencia respecto de epsilon se acota a cuando ese factor es
  comun y positivo para ambas estrategias, que es la condicion real
- la estabilidad de las correlaciones se formula como estabilidad del signo
  bajo el remuestreo empleado, y no como una propiedad absoluta
- el limite del bootstrap queda dicho como que evalua la incertidumbre de
  las estimaciones y no corrige la construccion de la variable
</commit_message>
<xml_diff>
--- a/S2/informe/Sumativa2_Informe_Maria_Fassler_Sebastian_Antunez.docx
+++ b/S2/informe/Sumativa2_Informe_Maria_Fassler_Sebastian_Antunez.docx
@@ -169,8 +169,18 @@
           <w:sz w:val="22"/>
           <w:szCs w:val="22"/>
         </w:rPr>
-        <w:t>Validación, simulación y métodos de remuestreo</w:t>
-      </w:r>
+        <w:t xml:space="preserve">Validación, simulación y métodos de </w:t>
+      </w:r>
+      <w:proofErr w:type="spellStart"/>
+      <w:r>
+        <w:rPr>
+          <w:rFonts w:asciiTheme="minorHAnsi" w:eastAsia="Arial" w:hAnsiTheme="minorHAnsi" w:cstheme="minorHAnsi"/>
+          <w:sz w:val="22"/>
+          <w:szCs w:val="22"/>
+        </w:rPr>
+        <w:t>remuestreo</w:t>
+      </w:r>
+      <w:proofErr w:type="spellEnd"/>
     </w:p>
     <w:p>
       <w:pPr>
@@ -237,7 +247,25 @@
           <w:sz w:val="21"/>
           <w:szCs w:val="21"/>
         </w:rPr>
-        <w:t>María Fassler Neumann · Sebastian Antunez Noguera — Grupo 4</w:t>
+        <w:t xml:space="preserve">María </w:t>
+      </w:r>
+      <w:proofErr w:type="spellStart"/>
+      <w:r>
+        <w:rPr>
+          <w:rFonts w:asciiTheme="minorHAnsi" w:eastAsia="Arial" w:hAnsiTheme="minorHAnsi" w:cstheme="minorHAnsi"/>
+          <w:sz w:val="21"/>
+          <w:szCs w:val="21"/>
+        </w:rPr>
+        <w:t>Fassler</w:t>
+      </w:r>
+      <w:proofErr w:type="spellEnd"/>
+      <w:r>
+        <w:rPr>
+          <w:rFonts w:asciiTheme="minorHAnsi" w:eastAsia="Arial" w:hAnsiTheme="minorHAnsi" w:cstheme="minorHAnsi"/>
+          <w:sz w:val="21"/>
+          <w:szCs w:val="21"/>
+        </w:rPr>
+        <w:t xml:space="preserve"> Neumann · Sebastian Antunez Noguera — Grupo 4</w:t>
       </w:r>
     </w:p>
     <w:p>
@@ -522,7 +550,6 @@
         <w:alias w:val="Indice"/>
         <w:id w:val="-446858611"/>
       </w:sdtPr>
-      <w:sdtEndPr/>
       <w:sdtContent>
         <w:p>
           <w:pPr>
@@ -670,7 +697,7 @@
               <w:rPr>
                 <w:noProof/>
               </w:rPr>
-              <w:t>3</w:t>
+              <w:t>4</w:t>
             </w:r>
             <w:r>
               <w:rPr>
@@ -1153,9 +1180,22 @@
           <w:szCs w:val="25"/>
         </w:rPr>
         <w:lastRenderedPageBreak/>
-        <w:t>1. Validación de resultados de S1 mediante bootstrap</w:t>
+        <w:t xml:space="preserve">1. Validación de resultados de S1 mediante </w:t>
+      </w:r>
+      <w:proofErr w:type="spellStart"/>
+      <w:r>
+        <w:rPr>
+          <w:rFonts w:asciiTheme="minorHAnsi" w:hAnsiTheme="minorHAnsi" w:cstheme="minorHAnsi"/>
+          <w:b/>
+          <w:bCs/>
+          <w:color w:val="auto"/>
+          <w:sz w:val="25"/>
+          <w:szCs w:val="25"/>
+        </w:rPr>
+        <w:t>bootstrap</w:t>
       </w:r>
       <w:bookmarkEnd w:id="0"/>
+      <w:proofErr w:type="spellEnd"/>
     </w:p>
     <w:p>
       <w:pPr>
@@ -1169,13 +1209,81 @@
         <w:rPr>
           <w:rFonts w:asciiTheme="minorHAnsi" w:hAnsiTheme="minorHAnsi" w:cstheme="minorHAnsi"/>
         </w:rPr>
-        <w:t xml:space="preserve">Aplicamos bootstrap no paramétrico (Efron y Tibshirani, 1993) con 10.000 remuestras a cuatro parámetros de la </w:t>
-      </w:r>
-      <w:r>
-        <w:rPr>
-          <w:rFonts w:asciiTheme="minorHAnsi" w:hAnsiTheme="minorHAnsi" w:cstheme="minorHAnsi"/>
-        </w:rPr>
-        <w:t>s</w:t>
+        <w:t xml:space="preserve">Aplicamos </w:t>
+      </w:r>
+      <w:proofErr w:type="spellStart"/>
+      <w:r>
+        <w:rPr>
+          <w:rFonts w:asciiTheme="minorHAnsi" w:hAnsiTheme="minorHAnsi" w:cstheme="minorHAnsi"/>
+        </w:rPr>
+        <w:t>bootstrap</w:t>
+      </w:r>
+      <w:proofErr w:type="spellEnd"/>
+      <w:r>
+        <w:rPr>
+          <w:rFonts w:asciiTheme="minorHAnsi" w:hAnsiTheme="minorHAnsi" w:cstheme="minorHAnsi"/>
+        </w:rPr>
+        <w:t xml:space="preserve"> no paramétrico (</w:t>
+      </w:r>
+      <w:proofErr w:type="spellStart"/>
+      <w:r>
+        <w:rPr>
+          <w:rFonts w:asciiTheme="minorHAnsi" w:hAnsiTheme="minorHAnsi" w:cstheme="minorHAnsi"/>
+        </w:rPr>
+        <w:t>Efron</w:t>
+      </w:r>
+      <w:proofErr w:type="spellEnd"/>
+      <w:r>
+        <w:rPr>
+          <w:rFonts w:asciiTheme="minorHAnsi" w:hAnsiTheme="minorHAnsi" w:cstheme="minorHAnsi"/>
+        </w:rPr>
+        <w:t xml:space="preserve"> y </w:t>
+      </w:r>
+      <w:proofErr w:type="spellStart"/>
+      <w:r>
+        <w:rPr>
+          <w:rFonts w:asciiTheme="minorHAnsi" w:hAnsiTheme="minorHAnsi" w:cstheme="minorHAnsi"/>
+        </w:rPr>
+        <w:t>Tibshirani</w:t>
+      </w:r>
+      <w:proofErr w:type="spellEnd"/>
+      <w:r>
+        <w:rPr>
+          <w:rFonts w:asciiTheme="minorHAnsi" w:hAnsiTheme="minorHAnsi" w:cstheme="minorHAnsi"/>
+        </w:rPr>
+        <w:t xml:space="preserve">, 1993) con 10.000 </w:t>
+      </w:r>
+      <w:proofErr w:type="spellStart"/>
+      <w:r>
+        <w:rPr>
+          <w:rFonts w:asciiTheme="minorHAnsi" w:hAnsiTheme="minorHAnsi" w:cstheme="minorHAnsi"/>
+        </w:rPr>
+        <w:t>remuestras</w:t>
+      </w:r>
+      <w:proofErr w:type="spellEnd"/>
+      <w:r>
+        <w:rPr>
+          <w:rFonts w:asciiTheme="minorHAnsi" w:hAnsiTheme="minorHAnsi" w:cstheme="minorHAnsi"/>
+        </w:rPr>
+        <w:t xml:space="preserve"> a cuatro </w:t>
+      </w:r>
+      <w:r>
+        <w:rPr>
+          <w:rFonts w:asciiTheme="minorHAnsi" w:hAnsiTheme="minorHAnsi" w:cstheme="minorHAnsi"/>
+        </w:rPr>
+        <w:t>estimaciones</w:t>
+      </w:r>
+      <w:r>
+        <w:rPr>
+          <w:rFonts w:asciiTheme="minorHAnsi" w:hAnsiTheme="minorHAnsi" w:cstheme="minorHAnsi"/>
+        </w:rPr>
+        <w:t xml:space="preserve"> de la </w:t>
+      </w:r>
+      <w:r>
+        <w:rPr>
+          <w:rFonts w:asciiTheme="minorHAnsi" w:hAnsiTheme="minorHAnsi" w:cstheme="minorHAnsi"/>
+        </w:rPr>
+        <w:t>S</w:t>
       </w:r>
       <w:r>
         <w:rPr>
@@ -1187,13 +1295,19 @@
         <w:rPr>
           <w:rFonts w:asciiTheme="minorHAnsi" w:hAnsiTheme="minorHAnsi" w:cstheme="minorHAnsi"/>
         </w:rPr>
-        <w:t>. L</w:t>
-      </w:r>
-      <w:r>
-        <w:rPr>
-          <w:rFonts w:asciiTheme="minorHAnsi" w:hAnsiTheme="minorHAnsi" w:cstheme="minorHAnsi"/>
-        </w:rPr>
-        <w:t>as tres medias estimadas</w:t>
+        <w:t xml:space="preserve">. </w:t>
+      </w:r>
+      <w:r>
+        <w:rPr>
+          <w:rFonts w:asciiTheme="minorHAnsi" w:hAnsiTheme="minorHAnsi" w:cstheme="minorHAnsi"/>
+        </w:rPr>
+        <w:t>Las</w:t>
+      </w:r>
+      <w:r>
+        <w:rPr>
+          <w:rFonts w:asciiTheme="minorHAnsi" w:hAnsiTheme="minorHAnsi" w:cstheme="minorHAnsi"/>
+        </w:rPr>
+        <w:t xml:space="preserve"> medias estimadas</w:t>
       </w:r>
       <w:r>
         <w:rPr>
@@ -1211,49 +1325,25 @@
         <w:rPr>
           <w:rFonts w:asciiTheme="minorHAnsi" w:hAnsiTheme="minorHAnsi" w:cstheme="minorHAnsi"/>
         </w:rPr>
-        <w:t>tiempo</w:t>
-      </w:r>
-      <w:r>
-        <w:rPr>
-          <w:rFonts w:asciiTheme="minorHAnsi" w:hAnsiTheme="minorHAnsi" w:cstheme="minorHAnsi"/>
-        </w:rPr>
-        <w:t xml:space="preserve"> de matrícula y proporción de mujeres</w:t>
-      </w:r>
-      <w:r>
-        <w:rPr>
-          <w:rFonts w:asciiTheme="minorHAnsi" w:hAnsiTheme="minorHAnsi" w:cstheme="minorHAnsi"/>
-        </w:rPr>
-        <w:t xml:space="preserve">, más </w:t>
-      </w:r>
-      <w:r>
-        <w:rPr>
-          <w:rFonts w:asciiTheme="minorHAnsi" w:hAnsiTheme="minorHAnsi" w:cstheme="minorHAnsi"/>
-        </w:rPr>
-        <w:t xml:space="preserve">la proporción de programas que superan el umbral del 50 %, cuyo intervalo se había construido </w:t>
-      </w:r>
-      <w:r>
-        <w:rPr>
-          <w:rFonts w:asciiTheme="minorHAnsi" w:hAnsiTheme="minorHAnsi" w:cstheme="minorHAnsi"/>
-        </w:rPr>
-        <w:t>con</w:t>
-      </w:r>
-      <w:r>
-        <w:rPr>
-          <w:rFonts w:asciiTheme="minorHAnsi" w:hAnsiTheme="minorHAnsi" w:cstheme="minorHAnsi"/>
-        </w:rPr>
-        <w:t xml:space="preserve"> el método de Wilson. Para cada uno calculamos el intervalo percentil y el BCa, que corrige </w:t>
-      </w:r>
-      <w:r>
-        <w:rPr>
-          <w:rFonts w:asciiTheme="minorHAnsi" w:hAnsiTheme="minorHAnsi" w:cstheme="minorHAnsi"/>
-        </w:rPr>
-        <w:t xml:space="preserve">el </w:t>
-      </w:r>
-      <w:r>
-        <w:rPr>
-          <w:rFonts w:asciiTheme="minorHAnsi" w:hAnsiTheme="minorHAnsi" w:cstheme="minorHAnsi"/>
-        </w:rPr>
-        <w:t>sesgo y aceleración (Efron, 1987)</w:t>
+        <w:t>edad de los estudiantes</w:t>
+      </w:r>
+      <w:r>
+        <w:rPr>
+          <w:rFonts w:asciiTheme="minorHAnsi" w:hAnsiTheme="minorHAnsi" w:cstheme="minorHAnsi"/>
+        </w:rPr>
+        <w:t xml:space="preserve"> y proporción de mujeres</w:t>
+      </w:r>
+      <w:r>
+        <w:rPr>
+          <w:rFonts w:asciiTheme="minorHAnsi" w:hAnsiTheme="minorHAnsi" w:cstheme="minorHAnsi"/>
+        </w:rPr>
+        <w:t xml:space="preserve">, </w:t>
+      </w:r>
+      <w:r>
+        <w:rPr>
+          <w:rFonts w:asciiTheme="minorHAnsi" w:hAnsiTheme="minorHAnsi" w:cstheme="minorHAnsi"/>
+        </w:rPr>
+        <w:t>y</w:t>
       </w:r>
       <w:r>
         <w:rPr>
@@ -1265,7 +1355,59 @@
         <w:rPr>
           <w:rFonts w:asciiTheme="minorHAnsi" w:hAnsiTheme="minorHAnsi" w:cstheme="minorHAnsi"/>
         </w:rPr>
-        <w:t>y los comparamos con el clásico de S1.</w:t>
+        <w:t xml:space="preserve">la proporción de programas </w:t>
+      </w:r>
+      <w:r>
+        <w:rPr>
+          <w:rFonts w:asciiTheme="minorHAnsi" w:hAnsiTheme="minorHAnsi" w:cstheme="minorHAnsi"/>
+        </w:rPr>
+        <w:t xml:space="preserve">cuyo abandono supera el </w:t>
+      </w:r>
+      <w:r>
+        <w:rPr>
+          <w:rFonts w:asciiTheme="minorHAnsi" w:hAnsiTheme="minorHAnsi" w:cstheme="minorHAnsi"/>
+        </w:rPr>
+        <w:t>50%</w:t>
+      </w:r>
+      <w:r>
+        <w:rPr>
+          <w:rFonts w:asciiTheme="minorHAnsi" w:hAnsiTheme="minorHAnsi" w:cstheme="minorHAnsi"/>
+        </w:rPr>
+        <w:t xml:space="preserve">. </w:t>
+      </w:r>
+      <w:r>
+        <w:rPr>
+          <w:rFonts w:asciiTheme="minorHAnsi" w:hAnsiTheme="minorHAnsi" w:cstheme="minorHAnsi"/>
+        </w:rPr>
+        <w:t xml:space="preserve">Para cada estimación calculamos un intervalo percentil y un intervalo </w:t>
+      </w:r>
+      <w:proofErr w:type="spellStart"/>
+      <w:r>
+        <w:rPr>
+          <w:rFonts w:asciiTheme="minorHAnsi" w:hAnsiTheme="minorHAnsi" w:cstheme="minorHAnsi"/>
+        </w:rPr>
+        <w:t>BCa</w:t>
+      </w:r>
+      <w:proofErr w:type="spellEnd"/>
+      <w:r>
+        <w:rPr>
+          <w:rFonts w:asciiTheme="minorHAnsi" w:hAnsiTheme="minorHAnsi" w:cstheme="minorHAnsi"/>
+        </w:rPr>
+        <w:t>, que incorpora correcciones por sesgo y aceleración (</w:t>
+      </w:r>
+      <w:proofErr w:type="spellStart"/>
+      <w:r>
+        <w:rPr>
+          <w:rFonts w:asciiTheme="minorHAnsi" w:hAnsiTheme="minorHAnsi" w:cstheme="minorHAnsi"/>
+        </w:rPr>
+        <w:t>Efron</w:t>
+      </w:r>
+      <w:proofErr w:type="spellEnd"/>
+      <w:r>
+        <w:rPr>
+          <w:rFonts w:asciiTheme="minorHAnsi" w:hAnsiTheme="minorHAnsi" w:cstheme="minorHAnsi"/>
+        </w:rPr>
+        <w:t>, 1987). Luego los comparamos con los intervalos clásicos de S1; en el caso de la proporción de programas, la referencia es el intervalo de Wilson.</w:t>
       </w:r>
     </w:p>
     <w:p>
@@ -1280,31 +1422,55 @@
         <w:rPr>
           <w:rFonts w:asciiTheme="minorHAnsi" w:hAnsiTheme="minorHAnsi" w:cstheme="minorHAnsi"/>
         </w:rPr>
-        <w:t>Los tres métodos descansan en supuestos distintos</w:t>
-      </w:r>
-      <w:r>
-        <w:rPr>
-          <w:rFonts w:asciiTheme="minorHAnsi" w:hAnsiTheme="minorHAnsi" w:cstheme="minorHAnsi"/>
-        </w:rPr>
-        <w:t xml:space="preserve">, </w:t>
-      </w:r>
-      <w:r>
-        <w:rPr>
-          <w:rFonts w:asciiTheme="minorHAnsi" w:hAnsiTheme="minorHAnsi" w:cstheme="minorHAnsi"/>
-        </w:rPr>
-        <w:t>el clásico asume que la distribución de la media muestral es aproximadamente normal, el percentil supone que la distribución bootstrap está</w:t>
-      </w:r>
-      <w:r>
-        <w:rPr>
-          <w:rFonts w:asciiTheme="minorHAnsi" w:hAnsiTheme="minorHAnsi" w:cstheme="minorHAnsi"/>
-        </w:rPr>
-        <w:t xml:space="preserve"> </w:t>
-      </w:r>
-      <w:r>
-        <w:rPr>
-          <w:rFonts w:asciiTheme="minorHAnsi" w:hAnsiTheme="minorHAnsi" w:cstheme="minorHAnsi"/>
-        </w:rPr>
-        <w:t>centrada y es simétrica, y el BCa relaja ese supuesto corrigiendo el sesgo (z₀) y la asimetría (a).</w:t>
+        <w:t xml:space="preserve">Los métodos construyen los intervalos de manera diferente. Para las medias, el intervalo clásico utiliza una aproximación normal de la distribución muestral. El percentil toma directamente los cuantiles de las estimaciones </w:t>
+      </w:r>
+      <w:proofErr w:type="spellStart"/>
+      <w:r>
+        <w:rPr>
+          <w:rFonts w:asciiTheme="minorHAnsi" w:hAnsiTheme="minorHAnsi" w:cstheme="minorHAnsi"/>
+        </w:rPr>
+        <w:t>bootstrap</w:t>
+      </w:r>
+      <w:proofErr w:type="spellEnd"/>
+      <w:r>
+        <w:rPr>
+          <w:rFonts w:asciiTheme="minorHAnsi" w:hAnsiTheme="minorHAnsi" w:cstheme="minorHAnsi"/>
+        </w:rPr>
+        <w:t xml:space="preserve">, mientras que el </w:t>
+      </w:r>
+      <w:proofErr w:type="spellStart"/>
+      <w:r>
+        <w:rPr>
+          <w:rFonts w:asciiTheme="minorHAnsi" w:hAnsiTheme="minorHAnsi" w:cstheme="minorHAnsi"/>
+        </w:rPr>
+        <w:t>BCa</w:t>
+      </w:r>
+      <w:proofErr w:type="spellEnd"/>
+      <w:r>
+        <w:rPr>
+          <w:rFonts w:asciiTheme="minorHAnsi" w:hAnsiTheme="minorHAnsi" w:cstheme="minorHAnsi"/>
+        </w:rPr>
+        <w:t xml:space="preserve"> ajusta esos cuantiles mediante los parámetros de corrección por sesgo (z₀) y aceleración (a). El </w:t>
+      </w:r>
+      <w:proofErr w:type="spellStart"/>
+      <w:r>
+        <w:rPr>
+          <w:rFonts w:asciiTheme="minorHAnsi" w:hAnsiTheme="minorHAnsi" w:cstheme="minorHAnsi"/>
+        </w:rPr>
+        <w:t>remuestreo</w:t>
+      </w:r>
+      <w:proofErr w:type="spellEnd"/>
+      <w:r>
+        <w:rPr>
+          <w:rFonts w:asciiTheme="minorHAnsi" w:hAnsiTheme="minorHAnsi" w:cstheme="minorHAnsi"/>
+        </w:rPr>
+        <w:t xml:space="preserve"> también requiere que el esquema utilizado represente adecuadamente la estructura de los datos</w:t>
+      </w:r>
+      <w:r>
+        <w:rPr>
+          <w:rFonts w:asciiTheme="minorHAnsi" w:hAnsiTheme="minorHAnsi" w:cstheme="minorHAnsi"/>
+        </w:rPr>
+        <w:t>.</w:t>
       </w:r>
     </w:p>
     <w:p>
@@ -1451,6 +1617,7 @@
                 <w:rFonts w:asciiTheme="minorHAnsi" w:hAnsiTheme="minorHAnsi" w:cstheme="minorHAnsi"/>
               </w:rPr>
             </w:pPr>
+            <w:proofErr w:type="spellStart"/>
             <w:r>
               <w:rPr>
                 <w:rFonts w:asciiTheme="minorHAnsi" w:hAnsiTheme="minorHAnsi" w:cstheme="minorHAnsi"/>
@@ -1461,6 +1628,7 @@
               </w:rPr>
               <w:t>BCa</w:t>
             </w:r>
+            <w:proofErr w:type="spellEnd"/>
           </w:p>
         </w:tc>
         <w:tc>
@@ -1482,6 +1650,7 @@
                 <w:rFonts w:asciiTheme="minorHAnsi" w:hAnsiTheme="minorHAnsi" w:cstheme="minorHAnsi"/>
               </w:rPr>
             </w:pPr>
+            <w:proofErr w:type="spellStart"/>
             <w:r>
               <w:rPr>
                 <w:rFonts w:asciiTheme="minorHAnsi" w:hAnsiTheme="minorHAnsi" w:cstheme="minorHAnsi"/>
@@ -1490,7 +1659,18 @@
                 <w:sz w:val="16"/>
                 <w:szCs w:val="16"/>
               </w:rPr>
-              <w:t>Discrep.</w:t>
+              <w:t>Discrep</w:t>
+            </w:r>
+            <w:proofErr w:type="spellEnd"/>
+            <w:r>
+              <w:rPr>
+                <w:rFonts w:asciiTheme="minorHAnsi" w:hAnsiTheme="minorHAnsi" w:cstheme="minorHAnsi"/>
+                <w:b/>
+                <w:bCs/>
+                <w:sz w:val="16"/>
+                <w:szCs w:val="16"/>
+              </w:rPr>
+              <w:t>.</w:t>
             </w:r>
           </w:p>
         </w:tc>
@@ -2076,7 +2256,29 @@
           <w:sz w:val="15"/>
           <w:szCs w:val="15"/>
         </w:rPr>
-        <w:t>Tabla 1: Intervalos de confianza al 95 %: clásico de S1, percentil y BCa.</w:t>
+        <w:t xml:space="preserve">Tabla 1: Intervalos de confianza al 95 %: clásico de S1, percentil y </w:t>
+      </w:r>
+      <w:proofErr w:type="spellStart"/>
+      <w:r>
+        <w:rPr>
+          <w:rFonts w:asciiTheme="minorHAnsi" w:hAnsiTheme="minorHAnsi" w:cstheme="minorHAnsi"/>
+          <w:i/>
+          <w:iCs/>
+          <w:sz w:val="15"/>
+          <w:szCs w:val="15"/>
+        </w:rPr>
+        <w:t>BCa</w:t>
+      </w:r>
+      <w:proofErr w:type="spellEnd"/>
+      <w:r>
+        <w:rPr>
+          <w:rFonts w:asciiTheme="minorHAnsi" w:hAnsiTheme="minorHAnsi" w:cstheme="minorHAnsi"/>
+          <w:i/>
+          <w:iCs/>
+          <w:sz w:val="15"/>
+          <w:szCs w:val="15"/>
+        </w:rPr>
+        <w:t>.</w:t>
       </w:r>
     </w:p>
     <w:p>
@@ -2148,7 +2350,73 @@
           <w:sz w:val="15"/>
           <w:szCs w:val="15"/>
         </w:rPr>
-        <w:t>Figura 1: Distribuciones bootstrap de los cuatro parámetros (10.000 remuestras). La línea negra marca la estimación puntual, la roja discontinua el IC BCa y la azul punteada el IC clásico de S1.</w:t>
+        <w:t xml:space="preserve">Figura 1: Distribuciones </w:t>
+      </w:r>
+      <w:proofErr w:type="spellStart"/>
+      <w:r>
+        <w:rPr>
+          <w:rFonts w:asciiTheme="minorHAnsi" w:hAnsiTheme="minorHAnsi" w:cstheme="minorHAnsi"/>
+          <w:i/>
+          <w:iCs/>
+          <w:sz w:val="15"/>
+          <w:szCs w:val="15"/>
+        </w:rPr>
+        <w:t>bootstrap</w:t>
+      </w:r>
+      <w:proofErr w:type="spellEnd"/>
+      <w:r>
+        <w:rPr>
+          <w:rFonts w:asciiTheme="minorHAnsi" w:hAnsiTheme="minorHAnsi" w:cstheme="minorHAnsi"/>
+          <w:i/>
+          <w:iCs/>
+          <w:sz w:val="15"/>
+          <w:szCs w:val="15"/>
+        </w:rPr>
+        <w:t xml:space="preserve"> de los cuatro parámetros (10.000 </w:t>
+      </w:r>
+      <w:proofErr w:type="spellStart"/>
+      <w:r>
+        <w:rPr>
+          <w:rFonts w:asciiTheme="minorHAnsi" w:hAnsiTheme="minorHAnsi" w:cstheme="minorHAnsi"/>
+          <w:i/>
+          <w:iCs/>
+          <w:sz w:val="15"/>
+          <w:szCs w:val="15"/>
+        </w:rPr>
+        <w:t>remuestras</w:t>
+      </w:r>
+      <w:proofErr w:type="spellEnd"/>
+      <w:r>
+        <w:rPr>
+          <w:rFonts w:asciiTheme="minorHAnsi" w:hAnsiTheme="minorHAnsi" w:cstheme="minorHAnsi"/>
+          <w:i/>
+          <w:iCs/>
+          <w:sz w:val="15"/>
+          <w:szCs w:val="15"/>
+        </w:rPr>
+        <w:t xml:space="preserve">). La línea negra marca la estimación puntual, la roja discontinua el IC </w:t>
+      </w:r>
+      <w:proofErr w:type="spellStart"/>
+      <w:r>
+        <w:rPr>
+          <w:rFonts w:asciiTheme="minorHAnsi" w:hAnsiTheme="minorHAnsi" w:cstheme="minorHAnsi"/>
+          <w:i/>
+          <w:iCs/>
+          <w:sz w:val="15"/>
+          <w:szCs w:val="15"/>
+        </w:rPr>
+        <w:t>BCa</w:t>
+      </w:r>
+      <w:proofErr w:type="spellEnd"/>
+      <w:r>
+        <w:rPr>
+          <w:rFonts w:asciiTheme="minorHAnsi" w:hAnsiTheme="minorHAnsi" w:cstheme="minorHAnsi"/>
+          <w:i/>
+          <w:iCs/>
+          <w:sz w:val="15"/>
+          <w:szCs w:val="15"/>
+        </w:rPr>
+        <w:t xml:space="preserve"> y la azul punteada el IC clásico de S1.</w:t>
       </w:r>
     </w:p>
     <w:p>
@@ -2163,67 +2431,21 @@
         <w:rPr>
           <w:rFonts w:asciiTheme="minorHAnsi" w:hAnsiTheme="minorHAnsi" w:cstheme="minorHAnsi"/>
         </w:rPr>
-        <w:t>Los factores de corrección son próximos a cero en los cuatro casos</w:t>
-      </w:r>
-      <w:r>
-        <w:rPr>
-          <w:rFonts w:asciiTheme="minorHAnsi" w:hAnsiTheme="minorHAnsi" w:cstheme="minorHAnsi"/>
-        </w:rPr>
-        <w:t>, donde</w:t>
-      </w:r>
-      <w:r>
-        <w:rPr>
-          <w:rFonts w:asciiTheme="minorHAnsi" w:hAnsiTheme="minorHAnsi" w:cstheme="minorHAnsi"/>
-        </w:rPr>
-        <w:t xml:space="preserve"> z₀ varía entre −0,015 y +0,017, y a entre −0,0003 y +0,0020. En </w:t>
-      </w:r>
-      <w:r>
-        <w:rPr>
-          <w:rFonts w:asciiTheme="minorHAnsi" w:hAnsiTheme="minorHAnsi" w:cstheme="minorHAnsi"/>
-        </w:rPr>
-        <w:t>consecuencia,</w:t>
-      </w:r>
-      <w:r>
-        <w:rPr>
-          <w:rFonts w:asciiTheme="minorHAnsi" w:hAnsiTheme="minorHAnsi" w:cstheme="minorHAnsi"/>
-        </w:rPr>
-        <w:t xml:space="preserve"> el BCa apenas se desplaza respecto del percentil</w:t>
-      </w:r>
-      <w:r>
-        <w:rPr>
-          <w:rFonts w:asciiTheme="minorHAnsi" w:hAnsiTheme="minorHAnsi" w:cstheme="minorHAnsi"/>
-        </w:rPr>
-        <w:t xml:space="preserve">, </w:t>
-      </w:r>
-      <w:r>
-        <w:rPr>
-          <w:rFonts w:asciiTheme="minorHAnsi" w:hAnsiTheme="minorHAnsi" w:cstheme="minorHAnsi"/>
-        </w:rPr>
-        <w:t xml:space="preserve">como máximo 0,0016 en la edad de los estudiantes y los tres intervalos se superponen, con discrepancias de amplitud inferiores al 0,9 %. Que </w:t>
-      </w:r>
-      <w:r>
-        <w:rPr>
-          <w:rFonts w:asciiTheme="minorHAnsi" w:hAnsiTheme="minorHAnsi" w:cstheme="minorHAnsi"/>
-        </w:rPr>
-        <w:t xml:space="preserve">el </w:t>
-      </w:r>
-      <w:r>
-        <w:rPr>
-          <w:rFonts w:asciiTheme="minorHAnsi" w:hAnsiTheme="minorHAnsi" w:cstheme="minorHAnsi"/>
-        </w:rPr>
-        <w:t xml:space="preserve">percentil y BCa coincidan indica además que los estimadores son </w:t>
-      </w:r>
-      <w:r>
-        <w:rPr>
-          <w:rFonts w:asciiTheme="minorHAnsi" w:hAnsiTheme="minorHAnsi" w:cstheme="minorHAnsi"/>
-        </w:rPr>
-        <w:t xml:space="preserve">no </w:t>
-      </w:r>
-      <w:r>
-        <w:rPr>
-          <w:rFonts w:asciiTheme="minorHAnsi" w:hAnsiTheme="minorHAnsi" w:cstheme="minorHAnsi"/>
-        </w:rPr>
-        <w:t>sesgados en la práctica y que su distribución no está torcida.</w:t>
+        <w:t xml:space="preserve">Las correcciones son pequeñas en los cuatro casos: z₀ varía entre −0,015 y +0,017, y a entre −0,0003 y +0,0020. Por eso, el </w:t>
+      </w:r>
+      <w:proofErr w:type="spellStart"/>
+      <w:r>
+        <w:rPr>
+          <w:rFonts w:asciiTheme="minorHAnsi" w:hAnsiTheme="minorHAnsi" w:cstheme="minorHAnsi"/>
+        </w:rPr>
+        <w:t>BCa</w:t>
+      </w:r>
+      <w:proofErr w:type="spellEnd"/>
+      <w:r>
+        <w:rPr>
+          <w:rFonts w:asciiTheme="minorHAnsi" w:hAnsiTheme="minorHAnsi" w:cstheme="minorHAnsi"/>
+        </w:rPr>
+        <w:t xml:space="preserve"> apenas cambia respecto del percentil; el mayor desplazamiento es de 0,0016 en la edad media. Los tres intervalos se superponen y sus discrepancias de amplitud son inferiores al 0,9 %. Esta coincidencia sugiere que las correcciones por sesgo y asimetría tienen poca incidencia en estas estimaciones.</w:t>
       </w:r>
     </w:p>
     <w:p>
@@ -2238,85 +2460,49 @@
         <w:rPr>
           <w:rFonts w:asciiTheme="minorHAnsi" w:hAnsiTheme="minorHAnsi" w:cstheme="minorHAnsi"/>
         </w:rPr>
-        <w:t>S</w:t>
-      </w:r>
-      <w:r>
-        <w:rPr>
-          <w:rFonts w:asciiTheme="minorHAnsi" w:hAnsiTheme="minorHAnsi" w:cstheme="minorHAnsi"/>
-        </w:rPr>
-        <w:t xml:space="preserve">ignifica que el supuesto que la Sumativa 1 invocó sin comprobar se sostiene con </w:t>
-      </w:r>
-      <w:r>
-        <w:rPr>
-          <w:rFonts w:asciiTheme="minorHAnsi" w:hAnsiTheme="minorHAnsi" w:cstheme="minorHAnsi"/>
-        </w:rPr>
-        <w:t xml:space="preserve">las </w:t>
-      </w:r>
-      <w:r>
-        <w:rPr>
-          <w:rFonts w:asciiTheme="minorHAnsi" w:hAnsiTheme="minorHAnsi" w:cstheme="minorHAnsi"/>
-        </w:rPr>
-        <w:t>9.678 observaciones</w:t>
-      </w:r>
-      <w:r>
-        <w:rPr>
-          <w:rFonts w:asciiTheme="minorHAnsi" w:hAnsiTheme="minorHAnsi" w:cstheme="minorHAnsi"/>
-        </w:rPr>
-        <w:t>. La</w:t>
-      </w:r>
-      <w:r>
-        <w:rPr>
-          <w:rFonts w:asciiTheme="minorHAnsi" w:hAnsiTheme="minorHAnsi" w:cstheme="minorHAnsi"/>
-        </w:rPr>
-        <w:t xml:space="preserve"> distribución bootstrap de cada media resulta simétrica y campaniforme pese a que la variable de origen no lo sea, y el estimador no presenta sesgo apreciable. Cuando la variable es asimétrica o la cola es larga, z₀ y </w:t>
-      </w:r>
-      <w:r>
-        <w:rPr>
-          <w:rFonts w:asciiTheme="minorHAnsi" w:hAnsiTheme="minorHAnsi" w:cstheme="minorHAnsi"/>
-        </w:rPr>
-        <w:t>“</w:t>
-      </w:r>
-      <w:r>
-        <w:rPr>
-          <w:rFonts w:asciiTheme="minorHAnsi" w:hAnsiTheme="minorHAnsi" w:cstheme="minorHAnsi"/>
-        </w:rPr>
-        <w:t>a</w:t>
-      </w:r>
-      <w:r>
-        <w:rPr>
-          <w:rFonts w:asciiTheme="minorHAnsi" w:hAnsiTheme="minorHAnsi" w:cstheme="minorHAnsi"/>
-        </w:rPr>
-        <w:t>”</w:t>
-      </w:r>
-      <w:r>
-        <w:rPr>
-          <w:rFonts w:asciiTheme="minorHAnsi" w:hAnsiTheme="minorHAnsi" w:cstheme="minorHAnsi"/>
-        </w:rPr>
-        <w:t xml:space="preserve"> crecen y el BCa se vuelve el más confiable</w:t>
-      </w:r>
-      <w:r>
-        <w:rPr>
-          <w:rFonts w:asciiTheme="minorHAnsi" w:hAnsiTheme="minorHAnsi" w:cstheme="minorHAnsi"/>
-        </w:rPr>
-        <w:t>. A</w:t>
-      </w:r>
-      <w:r>
-        <w:rPr>
-          <w:rFonts w:asciiTheme="minorHAnsi" w:hAnsiTheme="minorHAnsi" w:cstheme="minorHAnsi"/>
-        </w:rPr>
-        <w:t xml:space="preserve">quí los tres coinciden y el </w:t>
-      </w:r>
-      <w:r>
-        <w:rPr>
-          <w:rFonts w:asciiTheme="minorHAnsi" w:hAnsiTheme="minorHAnsi" w:cstheme="minorHAnsi"/>
-        </w:rPr>
-        <w:t>clásico basto</w:t>
-      </w:r>
-      <w:r>
-        <w:rPr>
-          <w:rFonts w:asciiTheme="minorHAnsi" w:hAnsiTheme="minorHAnsi" w:cstheme="minorHAnsi"/>
-        </w:rPr>
-        <w:t>.</w:t>
+        <w:t xml:space="preserve">Las distribuciones </w:t>
+      </w:r>
+      <w:proofErr w:type="spellStart"/>
+      <w:r>
+        <w:rPr>
+          <w:rFonts w:asciiTheme="minorHAnsi" w:hAnsiTheme="minorHAnsi" w:cstheme="minorHAnsi"/>
+        </w:rPr>
+        <w:t>bootstrap</w:t>
+      </w:r>
+      <w:proofErr w:type="spellEnd"/>
+      <w:r>
+        <w:rPr>
+          <w:rFonts w:asciiTheme="minorHAnsi" w:hAnsiTheme="minorHAnsi" w:cstheme="minorHAnsi"/>
+        </w:rPr>
+        <w:t xml:space="preserve"> de las medias son aproximadamente simétricas y campaniformes, aunque las variables originales no necesariamente lo sean. Para estas estimaciones y bajo el esquema de </w:t>
+      </w:r>
+      <w:proofErr w:type="spellStart"/>
+      <w:r>
+        <w:rPr>
+          <w:rFonts w:asciiTheme="minorHAnsi" w:hAnsiTheme="minorHAnsi" w:cstheme="minorHAnsi"/>
+        </w:rPr>
+        <w:t>remuestreo</w:t>
+      </w:r>
+      <w:proofErr w:type="spellEnd"/>
+      <w:r>
+        <w:rPr>
+          <w:rFonts w:asciiTheme="minorHAnsi" w:hAnsiTheme="minorHAnsi" w:cstheme="minorHAnsi"/>
+        </w:rPr>
+        <w:t xml:space="preserve"> empleado, los intervalos clásicos ofrecen resultados muy similares a los de </w:t>
+      </w:r>
+      <w:proofErr w:type="spellStart"/>
+      <w:r>
+        <w:rPr>
+          <w:rFonts w:asciiTheme="minorHAnsi" w:hAnsiTheme="minorHAnsi" w:cstheme="minorHAnsi"/>
+        </w:rPr>
+        <w:t>bootstrap</w:t>
+      </w:r>
+      <w:proofErr w:type="spellEnd"/>
+      <w:r>
+        <w:rPr>
+          <w:rFonts w:asciiTheme="minorHAnsi" w:hAnsiTheme="minorHAnsi" w:cstheme="minorHAnsi"/>
+        </w:rPr>
+        <w:t>. Esto respalda su uso en este análisis, sin implicar que ambos métodos coincidan en cualquier conjunto de datos.</w:t>
       </w:r>
     </w:p>
     <w:p>
@@ -2331,26 +2517,45 @@
         <w:rPr>
           <w:rFonts w:asciiTheme="minorHAnsi" w:hAnsiTheme="minorHAnsi" w:cstheme="minorHAnsi"/>
         </w:rPr>
-        <w:t xml:space="preserve">El </w:t>
-      </w:r>
-      <w:r>
-        <w:rPr>
-          <w:rFonts w:asciiTheme="minorHAnsi" w:hAnsiTheme="minorHAnsi" w:cstheme="minorHAnsi"/>
-        </w:rPr>
-        <w:t>bootstrap valida la precisión con que se estima el promedio, no la construcción de la variable. Si el abandono aparente sobreestima el abandono real</w:t>
-      </w:r>
-      <w:r>
-        <w:rPr>
-          <w:rFonts w:asciiTheme="minorHAnsi" w:hAnsiTheme="minorHAnsi" w:cstheme="minorHAnsi"/>
-        </w:rPr>
-        <w:t xml:space="preserve">, </w:t>
-      </w:r>
-      <w:r>
-        <w:rPr>
-          <w:rFonts w:asciiTheme="minorHAnsi" w:hAnsiTheme="minorHAnsi" w:cstheme="minorHAnsi"/>
-        </w:rPr>
-        <w:t>y la Sumativa 1 argumentó que lo hace, el bootstrap reproducirá fielmente ese sesgo, porque remuestrea los mismos datos que lo contienen.</w:t>
-      </w:r>
+        <w:t xml:space="preserve">Esta validación tiene un límite: el </w:t>
+      </w:r>
+      <w:proofErr w:type="spellStart"/>
+      <w:r>
+        <w:rPr>
+          <w:rFonts w:asciiTheme="minorHAnsi" w:hAnsiTheme="minorHAnsi" w:cstheme="minorHAnsi"/>
+        </w:rPr>
+        <w:t>bootstrap</w:t>
+      </w:r>
+      <w:proofErr w:type="spellEnd"/>
+      <w:r>
+        <w:rPr>
+          <w:rFonts w:asciiTheme="minorHAnsi" w:hAnsiTheme="minorHAnsi" w:cstheme="minorHAnsi"/>
+        </w:rPr>
+        <w:t xml:space="preserve"> evalúa la incertidumbre de las estimaciones, pero no corrige la construcción de la variable. Si el abandono aparente sobreestima el abandono real, como se discutió en S1, el </w:t>
+      </w:r>
+      <w:proofErr w:type="spellStart"/>
+      <w:r>
+        <w:rPr>
+          <w:rFonts w:asciiTheme="minorHAnsi" w:hAnsiTheme="minorHAnsi" w:cstheme="minorHAnsi"/>
+        </w:rPr>
+        <w:t>remuestreo</w:t>
+      </w:r>
+      <w:proofErr w:type="spellEnd"/>
+      <w:r>
+        <w:rPr>
+          <w:rFonts w:asciiTheme="minorHAnsi" w:hAnsiTheme="minorHAnsi" w:cstheme="minorHAnsi"/>
+        </w:rPr>
+        <w:t xml:space="preserve"> conserva ese problema porque utiliza los mismos datos.</w:t>
+      </w:r>
+    </w:p>
+    <w:p>
+      <w:pPr>
+        <w:spacing w:after="100" w:line="252" w:lineRule="auto"/>
+        <w:jc w:val="both"/>
+        <w:rPr>
+          <w:rFonts w:asciiTheme="minorHAnsi" w:hAnsiTheme="minorHAnsi" w:cstheme="minorHAnsi"/>
+        </w:rPr>
+      </w:pPr>
     </w:p>
     <w:p>
       <w:pPr>
@@ -2371,6 +2576,7 @@
           <w:sz w:val="25"/>
           <w:szCs w:val="25"/>
         </w:rPr>
+        <w:lastRenderedPageBreak/>
         <w:t>2. Validación de pruebas de hipótesis mediante permutación</w:t>
       </w:r>
       <w:bookmarkEnd w:id="1"/>
@@ -2387,20 +2593,7 @@
         <w:rPr>
           <w:rFonts w:asciiTheme="minorHAnsi" w:hAnsiTheme="minorHAnsi" w:cstheme="minorHAnsi"/>
         </w:rPr>
-        <w:lastRenderedPageBreak/>
-        <w:t>Validamos la t de Welch sobre la acreditación institucional, que en S1 comparó el abandono de los programas de instituciones nunca acreditadas (n = 757) con el de las siempre acreditadas (n = 7.672). Es el contraste que más pesa en las conclusiones</w:t>
-      </w:r>
-      <w:r>
-        <w:rPr>
-          <w:rFonts w:asciiTheme="minorHAnsi" w:hAnsiTheme="minorHAnsi" w:cstheme="minorHAnsi"/>
-        </w:rPr>
-        <w:t xml:space="preserve"> pues</w:t>
-      </w:r>
-      <w:r>
-        <w:rPr>
-          <w:rFonts w:asciiTheme="minorHAnsi" w:hAnsiTheme="minorHAnsi" w:cstheme="minorHAnsi"/>
-        </w:rPr>
-        <w:t xml:space="preserve"> fue el único con tamaño del efecto grande (d = 0,80) y el que sostiene la recomendación de focalización.</w:t>
+        <w:t>Revisamos la prueba t de Welch de S1, que comparó el abandono de los programas de instituciones nunca acreditadas (n = 757) con el de instituciones siempre acreditadas (n = 7.672). Elegimos este contraste porque presentó un tamaño del efecto grande (d = 0,80) y tuvo un papel importante en la discusión sobre focalización.</w:t>
       </w:r>
     </w:p>
     <w:p>
@@ -2415,7 +2608,7 @@
         <w:rPr>
           <w:rFonts w:asciiTheme="minorHAnsi" w:hAnsiTheme="minorHAnsi" w:cstheme="minorHAnsi"/>
         </w:rPr>
-        <w:t>Si la acreditación fuese irrelevante, las etiquetas de grupo serían intercambiables. El test de permutación (Good, 2005) reasigna esas etiquetas al azar 10.000 veces y construye así la distribución del estadístico bajo la hipótesis nula, sin suponer normalidad ni aproximar grados de libertad.</w:t>
+        <w:t>La prueba de permutación (Good, 2005) reasigna al azar las etiquetas de acreditación 10.000 veces y calcula en cada repetición la diferencia de medias. Así construye una distribución de referencia bajo la hipótesis nula. El procedimiento no requiere normalidad, pero su validez depende de que las etiquetas sean intercambiables bajo esa hipótesis; la igualdad de medias, por sí sola, no garantiza esa condición.</w:t>
       </w:r>
     </w:p>
     <w:p>
@@ -2498,23 +2691,12 @@
           <w:rFonts w:asciiTheme="minorHAnsi" w:hAnsiTheme="minorHAnsi" w:cstheme="minorHAnsi"/>
         </w:rPr>
       </w:pPr>
-      <w:r>
-        <w:rPr>
-          <w:rFonts w:asciiTheme="minorHAnsi" w:hAnsiTheme="minorHAnsi" w:cstheme="minorHAnsi"/>
-        </w:rPr>
-        <w:t>La diferencia observada es de +0,1757, mientras que la distribución nula se concentra en cero con una desviación típica de 0,0085 y un máximo absoluto de 0,0386</w:t>
-      </w:r>
-      <w:r>
-        <w:rPr>
-          <w:rFonts w:asciiTheme="minorHAnsi" w:hAnsiTheme="minorHAnsi" w:cstheme="minorHAnsi"/>
-        </w:rPr>
-        <w:t>. N</w:t>
-      </w:r>
-      <w:r>
-        <w:rPr>
-          <w:rFonts w:asciiTheme="minorHAnsi" w:hAnsiTheme="minorHAnsi" w:cstheme="minorHAnsi"/>
-        </w:rPr>
-        <w:t>inguna de las 10.000 permutaciones se acerca al valor observado, de modo que el valor p de permutación es 0,0002, el mínimo que el procedimiento puede devolver en un contraste bilateral. La distancia es de más de veinte desviaciones típicas de la distribución nula.</w:t>
+      <w:bookmarkStart w:id="2" w:name="_Toc243059333"/>
+      <w:r>
+        <w:rPr>
+          <w:rFonts w:asciiTheme="minorHAnsi" w:hAnsiTheme="minorHAnsi" w:cstheme="minorHAnsi"/>
+        </w:rPr>
+        <w:t>La diferencia observada es de +0,1757. En cambio, la distribución de permutación se concentra cerca de cero, con una desviación típica de 0,0085 y un máximo absoluto de 0,0386. Ninguna de las 10.000 permutaciones alcanza una diferencia tan extrema como la observada, situada a más de veinte desviaciones típicas del centro de esa distribución. El valor p bilateral reportado por el procedimiento es 0,0002; su resolución depende del número de permutaciones y de la forma de calcular las dos colas.</w:t>
       </w:r>
     </w:p>
     <w:p>
@@ -2529,19 +2711,19 @@
         <w:rPr>
           <w:rFonts w:asciiTheme="minorHAnsi" w:hAnsiTheme="minorHAnsi" w:cstheme="minorHAnsi"/>
         </w:rPr>
-        <w:t>Coincide con el resultado paramétrico de S1 en la decisión, pero ambos valores no son comparables en magnitud. El paramétrico, de 1,2 × 10⁻⁷⁷, extrapola a la cola de una distribución teórica y aparenta una precisión que no tiene, porque ninguna observación respalda esa región. El de permutación solo afirma lo que observó. Para este caso resulta más apropiado, por dos razones</w:t>
-      </w:r>
-      <w:r>
-        <w:rPr>
-          <w:rFonts w:asciiTheme="minorHAnsi" w:hAnsiTheme="minorHAnsi" w:cstheme="minorHAnsi"/>
-        </w:rPr>
-        <w:t xml:space="preserve">, </w:t>
-      </w:r>
-      <w:r>
-        <w:rPr>
-          <w:rFonts w:asciiTheme="minorHAnsi" w:hAnsiTheme="minorHAnsi" w:cstheme="minorHAnsi"/>
-        </w:rPr>
-        <w:t>no exige supuestos distribucionales y los grupos son muy desiguales en tamaño, situación en que las aproximaciones asintóticas se comportan peor.</w:t>
+        <w:t>La decisión coincide con la prueba paramétrica de S1</w:t>
+      </w:r>
+      <w:r>
+        <w:rPr>
+          <w:rFonts w:asciiTheme="minorHAnsi" w:hAnsiTheme="minorHAnsi" w:cstheme="minorHAnsi"/>
+        </w:rPr>
+        <w:t>: L</w:t>
+      </w:r>
+      <w:r>
+        <w:rPr>
+          <w:rFonts w:asciiTheme="minorHAnsi" w:hAnsiTheme="minorHAnsi" w:cstheme="minorHAnsi"/>
+        </w:rPr>
+        <w:t>os datos muestran una diferencia entre ambos grupos. Los valores p deben interpretarse dentro de cada método. El de Welch, 1,2 × 10⁻⁷⁷, proviene de una distribución teórica; el de permutación tiene una resolución limitada por las 10.000 reasignaciones. La coincidencia refuerza la conclusión del contraste, aunque no elimina la necesidad de revisar la intercambiabilidad de los grupos, especialmente ante diferencias de tamaño o varianza.</w:t>
       </w:r>
     </w:p>
     <w:p>
@@ -2553,7 +2735,6 @@
           <w:color w:val="auto"/>
         </w:rPr>
       </w:pPr>
-      <w:bookmarkStart w:id="2" w:name="_Toc243059333"/>
       <w:r>
         <w:rPr>
           <w:rFonts w:asciiTheme="minorHAnsi" w:hAnsiTheme="minorHAnsi" w:cstheme="minorHAnsi"/>
@@ -2579,19 +2760,35 @@
         <w:rPr>
           <w:rFonts w:asciiTheme="minorHAnsi" w:hAnsiTheme="minorHAnsi" w:cstheme="minorHAnsi"/>
         </w:rPr>
-        <w:t>Evaluamos cinco correlaciones de S1 con intervalos bootstrap al 95 %, remuestreando pares completos de observaciones para preservar la dependencia entre las dos variables. En S1 las nueve correlaciones reportadas resultaron significativas al 5 % por efecto del tamaño muestral</w:t>
-      </w:r>
-      <w:r>
-        <w:rPr>
-          <w:rFonts w:asciiTheme="minorHAnsi" w:hAnsiTheme="minorHAnsi" w:cstheme="minorHAnsi"/>
-        </w:rPr>
-        <w:t>,</w:t>
-      </w:r>
-      <w:r>
-        <w:rPr>
-          <w:rFonts w:asciiTheme="minorHAnsi" w:hAnsiTheme="minorHAnsi" w:cstheme="minorHAnsi"/>
-        </w:rPr>
-        <w:t xml:space="preserve"> la significación, sin embargo, no informa sobre la estabilidad.</w:t>
+        <w:t xml:space="preserve">Evaluamos cinco correlaciones de S1 mediante intervalos </w:t>
+      </w:r>
+      <w:proofErr w:type="spellStart"/>
+      <w:r>
+        <w:rPr>
+          <w:rFonts w:asciiTheme="minorHAnsi" w:hAnsiTheme="minorHAnsi" w:cstheme="minorHAnsi"/>
+        </w:rPr>
+        <w:t>bootstrap</w:t>
+      </w:r>
+      <w:proofErr w:type="spellEnd"/>
+      <w:r>
+        <w:rPr>
+          <w:rFonts w:asciiTheme="minorHAnsi" w:hAnsiTheme="minorHAnsi" w:cstheme="minorHAnsi"/>
+        </w:rPr>
+        <w:t xml:space="preserve"> al 95 %. </w:t>
+      </w:r>
+      <w:proofErr w:type="spellStart"/>
+      <w:r>
+        <w:rPr>
+          <w:rFonts w:asciiTheme="minorHAnsi" w:hAnsiTheme="minorHAnsi" w:cstheme="minorHAnsi"/>
+        </w:rPr>
+        <w:t>Remuestreamos</w:t>
+      </w:r>
+      <w:proofErr w:type="spellEnd"/>
+      <w:r>
+        <w:rPr>
+          <w:rFonts w:asciiTheme="minorHAnsi" w:hAnsiTheme="minorHAnsi" w:cstheme="minorHAnsi"/>
+        </w:rPr>
+        <w:t xml:space="preserve"> pares completos de observaciones para conservar la relación entre las variables. En S1, las nueve correlaciones reportadas fueron significativas al 5 %. Como el tamaño muestral puede facilitar la detección de asociaciones pequeñas, aquí examinamos también su magnitud y la amplitud de sus intervalos.</w:t>
       </w:r>
     </w:p>
     <w:p>
@@ -2715,7 +2912,29 @@
                 <w:sz w:val="16"/>
                 <w:szCs w:val="16"/>
               </w:rPr>
-              <w:t>IC bootstrap 95 %</w:t>
+              <w:t xml:space="preserve">IC </w:t>
+            </w:r>
+            <w:proofErr w:type="spellStart"/>
+            <w:r>
+              <w:rPr>
+                <w:rFonts w:asciiTheme="minorHAnsi" w:hAnsiTheme="minorHAnsi" w:cstheme="minorHAnsi"/>
+                <w:b/>
+                <w:bCs/>
+                <w:sz w:val="16"/>
+                <w:szCs w:val="16"/>
+              </w:rPr>
+              <w:t>bootstrap</w:t>
+            </w:r>
+            <w:proofErr w:type="spellEnd"/>
+            <w:r>
+              <w:rPr>
+                <w:rFonts w:asciiTheme="minorHAnsi" w:hAnsiTheme="minorHAnsi" w:cstheme="minorHAnsi"/>
+                <w:b/>
+                <w:bCs/>
+                <w:sz w:val="16"/>
+                <w:szCs w:val="16"/>
+              </w:rPr>
+              <w:t xml:space="preserve"> 95 %</w:t>
             </w:r>
           </w:p>
         </w:tc>
@@ -3498,7 +3717,29 @@
           <w:sz w:val="15"/>
           <w:szCs w:val="15"/>
         </w:rPr>
-        <w:t>Tabla 2: Estabilidad de cinco correlaciones de S1 según su intervalo bootstrap.</w:t>
+        <w:t xml:space="preserve">Tabla 2: Estabilidad de cinco correlaciones de S1 según su intervalo </w:t>
+      </w:r>
+      <w:proofErr w:type="spellStart"/>
+      <w:r>
+        <w:rPr>
+          <w:rFonts w:asciiTheme="minorHAnsi" w:hAnsiTheme="minorHAnsi" w:cstheme="minorHAnsi"/>
+          <w:i/>
+          <w:iCs/>
+          <w:sz w:val="15"/>
+          <w:szCs w:val="15"/>
+        </w:rPr>
+        <w:t>bootstrap</w:t>
+      </w:r>
+      <w:proofErr w:type="spellEnd"/>
+      <w:r>
+        <w:rPr>
+          <w:rFonts w:asciiTheme="minorHAnsi" w:hAnsiTheme="minorHAnsi" w:cstheme="minorHAnsi"/>
+          <w:i/>
+          <w:iCs/>
+          <w:sz w:val="15"/>
+          <w:szCs w:val="15"/>
+        </w:rPr>
+        <w:t>.</w:t>
       </w:r>
     </w:p>
     <w:p>
@@ -3571,7 +3812,29 @@
           <w:sz w:val="15"/>
           <w:szCs w:val="15"/>
         </w:rPr>
-        <w:t>Figura 3: Intervalos bootstrap al 95 % de las cinco correlaciones y sus distribuciones completas. Ninguna cruza el cero.</w:t>
+        <w:t xml:space="preserve">Figura 3: Intervalos </w:t>
+      </w:r>
+      <w:proofErr w:type="spellStart"/>
+      <w:r>
+        <w:rPr>
+          <w:rFonts w:asciiTheme="minorHAnsi" w:hAnsiTheme="minorHAnsi" w:cstheme="minorHAnsi"/>
+          <w:i/>
+          <w:iCs/>
+          <w:sz w:val="15"/>
+          <w:szCs w:val="15"/>
+        </w:rPr>
+        <w:t>bootstrap</w:t>
+      </w:r>
+      <w:proofErr w:type="spellEnd"/>
+      <w:r>
+        <w:rPr>
+          <w:rFonts w:asciiTheme="minorHAnsi" w:hAnsiTheme="minorHAnsi" w:cstheme="minorHAnsi"/>
+          <w:i/>
+          <w:iCs/>
+          <w:sz w:val="15"/>
+          <w:szCs w:val="15"/>
+        </w:rPr>
+        <w:t xml:space="preserve"> al 95 % de las cinco correlaciones y sus distribuciones completas. Ninguna cruza el cero.</w:t>
       </w:r>
     </w:p>
     <w:p>
@@ -3586,19 +3849,21 @@
         <w:rPr>
           <w:rFonts w:asciiTheme="minorHAnsi" w:hAnsiTheme="minorHAnsi" w:cstheme="minorHAnsi"/>
         </w:rPr>
-        <w:t>Ningún intervalo incluye el cero, de modo que el signo de las cinco está determinado por los datos y no por el azar del muestreo. Pero estabilidad y relevancia son cosas distintas</w:t>
-      </w:r>
-      <w:r>
-        <w:rPr>
-          <w:rFonts w:asciiTheme="minorHAnsi" w:hAnsiTheme="minorHAnsi" w:cstheme="minorHAnsi"/>
-        </w:rPr>
-        <w:t xml:space="preserve">, </w:t>
-      </w:r>
-      <w:r>
-        <w:rPr>
-          <w:rFonts w:asciiTheme="minorHAnsi" w:hAnsiTheme="minorHAnsi" w:cstheme="minorHAnsi"/>
-        </w:rPr>
-        <w:t>las tres correlaciones fuertes tienen intervalos estrechos frente a su propia magnitud, mientras que la del egreso municipal vale apenas +0,050 y su intervalo ocupa cuatro quintas partes de ese valor. Es estadísticamente distinta de cero y prácticamente irrelevante, exactamente la situación que S1 anticipó al advertir que con 9.678 observaciones todo resulta significativo.</w:t>
+        <w:t xml:space="preserve">Ninguno de los cinco intervalos incluye el cero, lo que respalda la estabilidad del signo bajo el </w:t>
+      </w:r>
+      <w:proofErr w:type="spellStart"/>
+      <w:r>
+        <w:rPr>
+          <w:rFonts w:asciiTheme="minorHAnsi" w:hAnsiTheme="minorHAnsi" w:cstheme="minorHAnsi"/>
+        </w:rPr>
+        <w:t>remuestreo</w:t>
+      </w:r>
+      <w:proofErr w:type="spellEnd"/>
+      <w:r>
+        <w:rPr>
+          <w:rFonts w:asciiTheme="minorHAnsi" w:hAnsiTheme="minorHAnsi" w:cstheme="minorHAnsi"/>
+        </w:rPr>
+        <w:t xml:space="preserve"> utilizado. Sin embargo, una asociación estable no necesariamente es relevante en términos prácticos. Las tres correlaciones de mayor magnitud tienen intervalos estrechos en relación con su estimación. En cambio, la correlación con el egreso de enseñanza municipal es de apenas +0,050, y la amplitud de su intervalo equivale a cerca del 79 % de ese valor. Aunque es estadísticamente distinta de cero, su magnitud es pequeña.</w:t>
       </w:r>
     </w:p>
     <w:p>
@@ -3636,43 +3901,7 @@
         <w:rPr>
           <w:rFonts w:asciiTheme="minorHAnsi" w:hAnsiTheme="minorHAnsi" w:cstheme="minorHAnsi"/>
         </w:rPr>
-        <w:t>S1 terminó con una recomendación que no pudo cuantificar</w:t>
-      </w:r>
-      <w:r>
-        <w:rPr>
-          <w:rFonts w:asciiTheme="minorHAnsi" w:hAnsiTheme="minorHAnsi" w:cstheme="minorHAnsi"/>
-        </w:rPr>
-        <w:t xml:space="preserve"> “F</w:t>
-      </w:r>
-      <w:r>
-        <w:rPr>
-          <w:rFonts w:asciiTheme="minorHAnsi" w:hAnsiTheme="minorHAnsi" w:cstheme="minorHAnsi"/>
-        </w:rPr>
-        <w:t>ocalizar por el nivel de abandono medido en cada programa y no por categorías administrativas</w:t>
-      </w:r>
-      <w:r>
-        <w:rPr>
-          <w:rFonts w:asciiTheme="minorHAnsi" w:hAnsiTheme="minorHAnsi" w:cstheme="minorHAnsi"/>
-        </w:rPr>
-        <w:t>”</w:t>
-      </w:r>
-      <w:r>
-        <w:rPr>
-          <w:rFonts w:asciiTheme="minorHAnsi" w:hAnsiTheme="minorHAnsi" w:cstheme="minorHAnsi"/>
-        </w:rPr>
-        <w:t>. La simulación (Robert y Casella, 2004) responde esa pregunta en los términos en que una autoridad la formularía</w:t>
-      </w:r>
-      <w:r>
-        <w:rPr>
-          <w:rFonts w:asciiTheme="minorHAnsi" w:hAnsiTheme="minorHAnsi" w:cstheme="minorHAnsi"/>
-        </w:rPr>
-        <w:t xml:space="preserve">, </w:t>
-      </w:r>
-      <w:r>
-        <w:rPr>
-          <w:rFonts w:asciiTheme="minorHAnsi" w:hAnsiTheme="minorHAnsi" w:cstheme="minorHAnsi"/>
-        </w:rPr>
-        <w:t>si solo puedo intervenir en una fracción de los programas, ¿cuántos estudiantes más alcanzo eligiéndolos por su abandono observado en lugar de por la acreditación de su institución?</w:t>
+        <w:t>En S1 propusimos focalizar las intervenciones según el abandono medido en cada programa, pero no cuantificamos la ventaja de esa decisión. La simulación Monte Carlo (Robert y Casella, 2004) aborda esa pregunta: si solo se puede intervenir en una parte de los programas, ¿cuántos estudiantes adicionales se retendrían al priorizar el abandono observado en vez de la acreditación institucional?</w:t>
       </w:r>
     </w:p>
     <w:p>
@@ -3687,79 +3916,7 @@
         <w:rPr>
           <w:rFonts w:asciiTheme="minorHAnsi" w:hAnsiTheme="minorHAnsi" w:cstheme="minorHAnsi"/>
         </w:rPr>
-        <w:t>Simulamos 10.000 sistemas de 8.429 programas</w:t>
-      </w:r>
-      <w:r>
-        <w:rPr>
-          <w:rFonts w:asciiTheme="minorHAnsi" w:hAnsiTheme="minorHAnsi" w:cstheme="minorHAnsi"/>
-        </w:rPr>
-        <w:t xml:space="preserve">, </w:t>
-      </w:r>
-      <w:r>
-        <w:rPr>
-          <w:rFonts w:asciiTheme="minorHAnsi" w:hAnsiTheme="minorHAnsi" w:cstheme="minorHAnsi"/>
-        </w:rPr>
-        <w:t>los de estado de acreditación inequívoco</w:t>
-      </w:r>
-      <w:r>
-        <w:rPr>
-          <w:rFonts w:asciiTheme="minorHAnsi" w:hAnsiTheme="minorHAnsi" w:cstheme="minorHAnsi"/>
-        </w:rPr>
-        <w:t xml:space="preserve">, </w:t>
-      </w:r>
-      <w:r>
-        <w:rPr>
-          <w:rFonts w:asciiTheme="minorHAnsi" w:hAnsiTheme="minorHAnsi" w:cstheme="minorHAnsi"/>
-        </w:rPr>
-        <w:t>con parámetros exclusivamente de S1</w:t>
-      </w:r>
-      <w:r>
-        <w:rPr>
-          <w:rFonts w:asciiTheme="minorHAnsi" w:hAnsiTheme="minorHAnsi" w:cstheme="minorHAnsi"/>
-        </w:rPr>
-        <w:t xml:space="preserve">, </w:t>
-      </w:r>
-      <w:r>
-        <w:rPr>
-          <w:rFonts w:asciiTheme="minorHAnsi" w:hAnsiTheme="minorHAnsi" w:cstheme="minorHAnsi"/>
-        </w:rPr>
-        <w:t>abandono medio 0,6636 (DE 0,2243) en los de instituciones nunca acreditadas y 0,4879 (DE 0,2178) en los acreditad</w:t>
-      </w:r>
-      <w:r>
-        <w:rPr>
-          <w:rFonts w:asciiTheme="minorHAnsi" w:hAnsiTheme="minorHAnsi" w:cstheme="minorHAnsi"/>
-        </w:rPr>
-        <w:t>o</w:t>
-      </w:r>
-      <w:r>
-        <w:rPr>
-          <w:rFonts w:asciiTheme="minorHAnsi" w:hAnsiTheme="minorHAnsi" w:cstheme="minorHAnsi"/>
-        </w:rPr>
-        <w:t>s, con una proporción del 9 % de los primeros, y la distribución empírica del ingreso. Sobre cada sistema comparamos dos estrategias con el mismo presupuesto, el 10 % de los programas</w:t>
-      </w:r>
-      <w:r>
-        <w:rPr>
-          <w:rFonts w:asciiTheme="minorHAnsi" w:hAnsiTheme="minorHAnsi" w:cstheme="minorHAnsi"/>
-        </w:rPr>
-        <w:t>. L</w:t>
-      </w:r>
-      <w:r>
-        <w:rPr>
-          <w:rFonts w:asciiTheme="minorHAnsi" w:hAnsiTheme="minorHAnsi" w:cstheme="minorHAnsi"/>
-        </w:rPr>
-        <w:t>a A prioriza los de instituciones no acreditadas</w:t>
-      </w:r>
-      <w:r>
-        <w:rPr>
-          <w:rFonts w:asciiTheme="minorHAnsi" w:hAnsiTheme="minorHAnsi" w:cstheme="minorHAnsi"/>
-        </w:rPr>
-        <w:t>,</w:t>
-      </w:r>
-      <w:r>
-        <w:rPr>
-          <w:rFonts w:asciiTheme="minorHAnsi" w:hAnsiTheme="minorHAnsi" w:cstheme="minorHAnsi"/>
-        </w:rPr>
-        <w:t xml:space="preserve"> la B elige los de mayor abandono. El modelo supone que la intervención recupera una fracción ε de quienes habrían abandonado, de modo que intervenir rinde más donde el abandono es mayor ε es un supuesto de política y no un parámetro estimado, y el apartado 5 muestra que la comparación es independiente de él.</w:t>
+        <w:t>Simulamos 10.000 sistemas de 8.429 programas con estado de acreditación inequívoco. Usamos los parámetros de S1: abandono medio de 0,6636 (DE 0,2243) en programas de instituciones nunca acreditadas y de 0,4879 (DE 0,2178) en los de instituciones siempre acreditadas, una proporción del 9 % de los primeros y la distribución empírica del ingreso. En cada sistema comparamos dos estrategias que intervienen el 10 % de los programas: A prioriza los de instituciones no acreditadas y B selecciona los de mayor abandono. Suponemos que la intervención retiene una fracción ε de quienes habrían abandonado. Esta eficacia es un supuesto de política, no una estimación de los datos. El apartado 5 examina por qué la ventaja relativa no depende de ε cuando su valor es común y positivo para ambas estrategias.</w:t>
       </w:r>
     </w:p>
     <w:p>
@@ -4473,12 +4630,13 @@
           <w:rFonts w:asciiTheme="minorHAnsi" w:hAnsiTheme="minorHAnsi" w:cstheme="minorHAnsi"/>
         </w:rPr>
       </w:pPr>
+      <w:bookmarkStart w:id="4" w:name="_Toc243059335"/>
       <w:r>
         <w:rPr>
           <w:rFonts w:asciiTheme="minorHAnsi" w:hAnsiTheme="minorHAnsi" w:cstheme="minorHAnsi"/>
         </w:rPr>
         <w:lastRenderedPageBreak/>
-        <w:t>Focalizar por el abandono observado alcanza a un 38,9 % más de estudiantes, con una diferencia media de 8.462. La estrategia B supera a la A en las 10.000 iteraciones y el percentil 2,5 de la ventaja, 6.306 estudiantes, queda muy lejos del cero.</w:t>
+        <w:t>Bajo los supuestos de la simulación, focalizar por abandono observado permite retener un 38,9 % más de estudiantes, con una diferencia media de 8.462. La estrategia B supera a la A en las 10.000 iteraciones, y el percentil 2,5 de la ventaja es de 6.306 estudiantes. Estos resultados describen los sistemas simulados y no constituyen, por sí solos, una estimación del efecto real de implementar la intervención.</w:t>
       </w:r>
     </w:p>
     <w:p>
@@ -4493,7 +4651,7 @@
         <w:rPr>
           <w:rFonts w:asciiTheme="minorHAnsi" w:hAnsiTheme="minorHAnsi" w:cstheme="minorHAnsi"/>
         </w:rPr>
-        <w:t>La media converge antes de las mil iteraciones y el error estándar de Monte Carlo al final del recorrido es de 11 estudiantes, un 0,25 % de la magnitud estimada; bastarían 644 iteraciones para una precisión del 1 %. Verificar convergencia permite separar la incertidumbre del fenómeno, que es grande, de la que introduce el método, que aquí es despreciable.</w:t>
+        <w:t>La media se estabiliza antes de las mil iteraciones. Al completar las 10.000, el error estándar de Monte Carlo es de aproximadamente 11 estudiantes, cerca del 0,13 % de la ventaja media estimada. Este error mide la precisión numérica de la simulación; es distinto de la variación entre los sistemas simulados y de la incertidumbre sobre los supuestos del modelo.</w:t>
       </w:r>
     </w:p>
     <w:p>
@@ -4508,7 +4666,7 @@
         <w:rPr>
           <w:rFonts w:asciiTheme="minorHAnsi" w:hAnsiTheme="minorHAnsi" w:cstheme="minorHAnsi"/>
         </w:rPr>
-        <w:t>Para la gestión, el resultado cuantifica la recomendación que S1 dejó enunciada: que la acreditación distinga grupos con un efecto grande no la convierte en buen criterio de focalización, porque los programas de instituciones no acreditadas son demasiado pocos para absorber el presupuesto y la mayor parte de los programas con abandono alto queda fuera de esa categoría.</w:t>
+        <w:t>El resultado aporta una medida concreta a la recomendación de S1. Aunque la acreditación distingue grupos con diferencias importantes, eso no garantiza que sea el mejor criterio para asignar intervenciones. En el escenario simulado, los programas de instituciones no acreditadas son pocos en relación con el presupuesto disponible, y muchos programas con alto abandono pertenecen a instituciones acreditadas.</w:t>
       </w:r>
     </w:p>
     <w:p>
@@ -4520,7 +4678,6 @@
           <w:color w:val="auto"/>
         </w:rPr>
       </w:pPr>
-      <w:bookmarkStart w:id="4" w:name="_Toc243059335"/>
       <w:r>
         <w:rPr>
           <w:rFonts w:asciiTheme="minorHAnsi" w:hAnsiTheme="minorHAnsi" w:cstheme="minorHAnsi"/>
@@ -4557,7 +4714,35 @@
         <w:rPr>
           <w:rFonts w:asciiTheme="minorHAnsi" w:hAnsiTheme="minorHAnsi" w:cstheme="minorHAnsi"/>
         </w:rPr>
-        <w:t>El jackknife sobre los 9.678 programas arroja un error estándar de 0,002276, idéntico al clásico e igual al bootstrap hasta la quinta cifra, y un sesgo estimado nulo. Ninguna observación individual desplaza la media más de 5,4 × 10⁻⁵: no hay programas influyentes, a diferencia de lo que ocurre con variables de cola larga.</w:t>
+        <w:t xml:space="preserve">El </w:t>
+      </w:r>
+      <w:proofErr w:type="spellStart"/>
+      <w:r>
+        <w:rPr>
+          <w:rFonts w:asciiTheme="minorHAnsi" w:hAnsiTheme="minorHAnsi" w:cstheme="minorHAnsi"/>
+        </w:rPr>
+        <w:t>jackknife</w:t>
+      </w:r>
+      <w:proofErr w:type="spellEnd"/>
+      <w:r>
+        <w:rPr>
+          <w:rFonts w:asciiTheme="minorHAnsi" w:hAnsiTheme="minorHAnsi" w:cstheme="minorHAnsi"/>
+        </w:rPr>
+        <w:t xml:space="preserve"> aplicado a los 9.678 programas entrega un error estándar de 0,002276, prácticamente igual al clásico y al </w:t>
+      </w:r>
+      <w:proofErr w:type="spellStart"/>
+      <w:r>
+        <w:rPr>
+          <w:rFonts w:asciiTheme="minorHAnsi" w:hAnsiTheme="minorHAnsi" w:cstheme="minorHAnsi"/>
+        </w:rPr>
+        <w:t>bootstrap</w:t>
+      </w:r>
+      <w:proofErr w:type="spellEnd"/>
+      <w:r>
+        <w:rPr>
+          <w:rFonts w:asciiTheme="minorHAnsi" w:hAnsiTheme="minorHAnsi" w:cstheme="minorHAnsi"/>
+        </w:rPr>
+        <w:t>, y un sesgo estimado nulo. Al retirar un programa a la vez, la media cambia como máximo 5,4 × 10⁻⁵. Por tanto, ninguna observación individual tiene una influencia importante sobre esta media. Esto no descarta efectos conjuntos asociados a grupos de programas o instituciones.</w:t>
       </w:r>
     </w:p>
     <w:p>
@@ -4572,7 +4757,7 @@
         <w:rPr>
           <w:rFonts w:asciiTheme="minorHAnsi" w:hAnsiTheme="minorHAnsi" w:cstheme="minorHAnsi"/>
         </w:rPr>
-        <w:t>La exclusión de los 465 programas censurados en 0 y en 1, identificados en S1, desplaza la media del abandono de 0,518 a 0,527 y reduce su desviación típica de 0,224 a 0,199. La correlación con la acreditación de carrera apenas se mueve, de −0,311 a −0,310, y el contraste de Welch mantiene su decisión. Son cambios pequeños, pero recuerdan que la censura de la variable no es inocua.</w:t>
+        <w:t>Al excluir los 465 programas censurados en 0 y 1, identificados en S1, la media del abandono pasa de 0,518 a 0,527 y su desviación típica baja de 0,224 a 0,199. La correlación con la acreditación de carrera apenas cambia, de −0,311 a −0,310, y la prueba de Welch mantiene su decisión. Las conclusiones principales se conservan, aunque la diferencia en la media muestra que el tratamiento de estos casos sí afecta la estimación.</w:t>
       </w:r>
     </w:p>
     <w:p>
@@ -4587,19 +4772,7 @@
         <w:rPr>
           <w:rFonts w:asciiTheme="minorHAnsi" w:hAnsiTheme="minorHAnsi" w:cstheme="minorHAnsi"/>
         </w:rPr>
-        <w:t>Sobre la simulación, la comparación entre estrategias es algebraicamente independiente de ε, porque ese factor multiplica por igual a ambas y se cancela en el cociente</w:t>
-      </w:r>
-      <w:r>
-        <w:rPr>
-          <w:rFonts w:asciiTheme="minorHAnsi" w:hAnsiTheme="minorHAnsi" w:cstheme="minorHAnsi"/>
-        </w:rPr>
-        <w:t>. L</w:t>
-      </w:r>
-      <w:r>
-        <w:rPr>
-          <w:rFonts w:asciiTheme="minorHAnsi" w:hAnsiTheme="minorHAnsi" w:cstheme="minorHAnsi"/>
-        </w:rPr>
-        <w:t>a conclusión no descansa sobre el supuesto que peor se conoce. Los ejes que sí podrían moverla son el presupuesto y la proporción de instituciones no acreditadas.</w:t>
+        <w:t>En la simulación, la ventaja relativa es independiente de ε cuando este factor es común y positivo para ambas estrategias, pues se cancela al calcular el cociente. La cantidad absoluta de estudiantes retenidos sí depende de su valor. Esta propiedad dejaría de sostenerse si la eficacia variara entre programas o estrategias. También examinamos el presupuesto disponible y la proporción de programas de instituciones no acreditadas.</w:t>
       </w:r>
     </w:p>
     <w:tbl>
@@ -5373,6 +5546,7 @@
           <w:rFonts w:asciiTheme="minorHAnsi" w:hAnsiTheme="minorHAnsi" w:cstheme="minorHAnsi"/>
         </w:rPr>
       </w:pPr>
+      <w:bookmarkStart w:id="5" w:name="_Hlk243060557"/>
       <w:r>
         <w:rPr>
           <w:rFonts w:asciiTheme="minorHAnsi" w:hAnsiTheme="minorHAnsi" w:cstheme="minorHAnsi"/>
@@ -5428,7 +5602,35 @@
         <w:rPr>
           <w:rFonts w:asciiTheme="minorHAnsi" w:hAnsiTheme="minorHAnsi" w:cstheme="minorHAnsi"/>
         </w:rPr>
-        <w:t>ningún método de remuestreo corrige un sesgo de construcción, porque remuestrea los mismos datos que lo contienen.</w:t>
+        <w:t xml:space="preserve">ningún método de </w:t>
+      </w:r>
+      <w:proofErr w:type="spellStart"/>
+      <w:r>
+        <w:rPr>
+          <w:rFonts w:asciiTheme="minorHAnsi" w:hAnsiTheme="minorHAnsi" w:cstheme="minorHAnsi"/>
+        </w:rPr>
+        <w:t>remuestreo</w:t>
+      </w:r>
+      <w:proofErr w:type="spellEnd"/>
+      <w:r>
+        <w:rPr>
+          <w:rFonts w:asciiTheme="minorHAnsi" w:hAnsiTheme="minorHAnsi" w:cstheme="minorHAnsi"/>
+        </w:rPr>
+        <w:t xml:space="preserve"> corrige un sesgo de construcción, porque </w:t>
+      </w:r>
+      <w:proofErr w:type="spellStart"/>
+      <w:r>
+        <w:rPr>
+          <w:rFonts w:asciiTheme="minorHAnsi" w:hAnsiTheme="minorHAnsi" w:cstheme="minorHAnsi"/>
+        </w:rPr>
+        <w:t>remuestrea</w:t>
+      </w:r>
+      <w:proofErr w:type="spellEnd"/>
+      <w:r>
+        <w:rPr>
+          <w:rFonts w:asciiTheme="minorHAnsi" w:hAnsiTheme="minorHAnsi" w:cstheme="minorHAnsi"/>
+        </w:rPr>
+        <w:t xml:space="preserve"> los mismos datos que lo contienen.</w:t>
       </w:r>
     </w:p>
     <w:p>
@@ -5440,7 +5642,8 @@
           <w:color w:val="auto"/>
         </w:rPr>
       </w:pPr>
-      <w:bookmarkStart w:id="5" w:name="_Toc243059336"/>
+      <w:bookmarkStart w:id="6" w:name="_Toc243059336"/>
+      <w:bookmarkEnd w:id="5"/>
       <w:r>
         <w:rPr>
           <w:rFonts w:asciiTheme="minorHAnsi" w:hAnsiTheme="minorHAnsi" w:cstheme="minorHAnsi"/>
@@ -5452,7 +5655,7 @@
         </w:rPr>
         <w:t>6. Preparación para la Sumativa 3</w:t>
       </w:r>
-      <w:bookmarkEnd w:id="5"/>
+      <w:bookmarkEnd w:id="6"/>
     </w:p>
     <w:p>
       <w:pPr>
@@ -5462,6 +5665,7 @@
           <w:rFonts w:asciiTheme="minorHAnsi" w:hAnsiTheme="minorHAnsi" w:cstheme="minorHAnsi"/>
         </w:rPr>
       </w:pPr>
+      <w:bookmarkStart w:id="7" w:name="_Hlk243060572"/>
       <w:r>
         <w:rPr>
           <w:rFonts w:asciiTheme="minorHAnsi" w:hAnsiTheme="minorHAnsi" w:cstheme="minorHAnsi"/>
@@ -5480,7 +5684,21 @@
         <w:rPr>
           <w:rFonts w:asciiTheme="minorHAnsi" w:hAnsiTheme="minorHAnsi" w:cstheme="minorHAnsi"/>
         </w:rPr>
-        <w:t>, en la raíz del repositorio, recoge en forma legible por máquina el veredicto de cada resultado, con sus intervalos clásico y bootstrap. La Tabla 5 lo resume.</w:t>
+        <w:t xml:space="preserve">, en la raíz del repositorio, recoge en forma legible por máquina el veredicto de cada resultado, con sus intervalos clásico y </w:t>
+      </w:r>
+      <w:proofErr w:type="spellStart"/>
+      <w:r>
+        <w:rPr>
+          <w:rFonts w:asciiTheme="minorHAnsi" w:hAnsiTheme="minorHAnsi" w:cstheme="minorHAnsi"/>
+        </w:rPr>
+        <w:t>bootstrap</w:t>
+      </w:r>
+      <w:proofErr w:type="spellEnd"/>
+      <w:r>
+        <w:rPr>
+          <w:rFonts w:asciiTheme="minorHAnsi" w:hAnsiTheme="minorHAnsi" w:cstheme="minorHAnsi"/>
+        </w:rPr>
+        <w:t>. La Tabla 5 lo resume.</w:t>
       </w:r>
     </w:p>
     <w:tbl>
@@ -5516,6 +5734,7 @@
               <w:right w:w="80" w:type="dxa"/>
             </w:tcMar>
           </w:tcPr>
+          <w:bookmarkEnd w:id="7"/>
           <w:p>
             <w:pPr>
               <w:spacing w:line="230" w:lineRule="auto"/>
@@ -5648,7 +5867,25 @@
                 <w:sz w:val="16"/>
                 <w:szCs w:val="16"/>
               </w:rPr>
-              <w:t>Clásico, percentil y BCa coinciden; z₀ y a nulos</w:t>
+              <w:t xml:space="preserve">Clásico, percentil y </w:t>
+            </w:r>
+            <w:proofErr w:type="spellStart"/>
+            <w:r>
+              <w:rPr>
+                <w:rFonts w:asciiTheme="minorHAnsi" w:hAnsiTheme="minorHAnsi" w:cstheme="minorHAnsi"/>
+                <w:sz w:val="16"/>
+                <w:szCs w:val="16"/>
+              </w:rPr>
+              <w:t>BCa</w:t>
+            </w:r>
+            <w:proofErr w:type="spellEnd"/>
+            <w:r>
+              <w:rPr>
+                <w:rFonts w:asciiTheme="minorHAnsi" w:hAnsiTheme="minorHAnsi" w:cstheme="minorHAnsi"/>
+                <w:sz w:val="16"/>
+                <w:szCs w:val="16"/>
+              </w:rPr>
+              <w:t xml:space="preserve"> coinciden; z₀ y a nulos</w:t>
             </w:r>
           </w:p>
         </w:tc>
@@ -5816,7 +6053,25 @@
                 <w:sz w:val="16"/>
                 <w:szCs w:val="16"/>
               </w:rPr>
-              <w:t>IC bootstrap estrechos, no cruzan el cero</w:t>
+              <w:t xml:space="preserve">IC </w:t>
+            </w:r>
+            <w:proofErr w:type="spellStart"/>
+            <w:r>
+              <w:rPr>
+                <w:rFonts w:asciiTheme="minorHAnsi" w:hAnsiTheme="minorHAnsi" w:cstheme="minorHAnsi"/>
+                <w:sz w:val="16"/>
+                <w:szCs w:val="16"/>
+              </w:rPr>
+              <w:t>bootstrap</w:t>
+            </w:r>
+            <w:proofErr w:type="spellEnd"/>
+            <w:r>
+              <w:rPr>
+                <w:rFonts w:asciiTheme="minorHAnsi" w:hAnsiTheme="minorHAnsi" w:cstheme="minorHAnsi"/>
+                <w:sz w:val="16"/>
+                <w:szCs w:val="16"/>
+              </w:rPr>
+              <w:t xml:space="preserve"> estrechos, no cruzan el cero</w:t>
             </w:r>
           </w:p>
         </w:tc>
@@ -5873,6 +6128,7 @@
                 <w:sz w:val="16"/>
                 <w:szCs w:val="16"/>
               </w:rPr>
+              <w:lastRenderedPageBreak/>
               <w:t>Correlación con egreso municipal</w:t>
             </w:r>
           </w:p>
@@ -6118,7 +6374,6 @@
           <w:sz w:val="15"/>
           <w:szCs w:val="15"/>
         </w:rPr>
-        <w:lastRenderedPageBreak/>
         <w:t>Tabla 5: Reporte de resultados validados para la Sumativa 3.</w:t>
       </w:r>
     </w:p>
@@ -6166,7 +6421,21 @@
         <w:rPr>
           <w:rFonts w:asciiTheme="minorHAnsi" w:hAnsiTheme="minorHAnsi" w:cstheme="minorHAnsi"/>
         </w:rPr>
-        <w:t xml:space="preserve">Reportar los intervalos BCa en lugar de los clásicos: coinciden, de modo que no hay costo, y no dependen de supuestos. </w:t>
+        <w:t xml:space="preserve">Reportar los intervalos </w:t>
+      </w:r>
+      <w:proofErr w:type="spellStart"/>
+      <w:r>
+        <w:rPr>
+          <w:rFonts w:asciiTheme="minorHAnsi" w:hAnsiTheme="minorHAnsi" w:cstheme="minorHAnsi"/>
+        </w:rPr>
+        <w:t>BCa</w:t>
+      </w:r>
+      <w:proofErr w:type="spellEnd"/>
+      <w:r>
+        <w:rPr>
+          <w:rFonts w:asciiTheme="minorHAnsi" w:hAnsiTheme="minorHAnsi" w:cstheme="minorHAnsi"/>
+        </w:rPr>
+        <w:t xml:space="preserve"> en lugar de los clásicos: coinciden, de modo que no hay costo, y no dependen de supuestos. </w:t>
       </w:r>
     </w:p>
     <w:p>
@@ -6238,7 +6507,7 @@
           <w:color w:val="auto"/>
         </w:rPr>
       </w:pPr>
-      <w:bookmarkStart w:id="6" w:name="_Toc243059337"/>
+      <w:bookmarkStart w:id="8" w:name="_Toc243059337"/>
       <w:r>
         <w:rPr>
           <w:rFonts w:asciiTheme="minorHAnsi" w:hAnsiTheme="minorHAnsi" w:cstheme="minorHAnsi"/>
@@ -6250,7 +6519,7 @@
         </w:rPr>
         <w:t>6.1 Reproducibilidad</w:t>
       </w:r>
-      <w:bookmarkEnd w:id="6"/>
+      <w:bookmarkEnd w:id="8"/>
     </w:p>
     <w:p>
       <w:pPr>
@@ -6260,67 +6529,26 @@
           <w:rFonts w:asciiTheme="minorHAnsi" w:hAnsiTheme="minorHAnsi" w:cstheme="minorHAnsi"/>
         </w:rPr>
       </w:pPr>
-      <w:r>
-        <w:rPr>
-          <w:rFonts w:asciiTheme="minorHAnsi" w:hAnsiTheme="minorHAnsi" w:cstheme="minorHAnsi"/>
-        </w:rPr>
-        <w:t xml:space="preserve">Todas las cifras de este informe se generan al ejecutar </w:t>
-      </w:r>
-      <w:r>
-        <w:rPr>
-          <w:rFonts w:asciiTheme="minorHAnsi" w:eastAsia="Consolas" w:hAnsiTheme="minorHAnsi" w:cstheme="minorHAnsi"/>
-          <w:sz w:val="17"/>
-          <w:szCs w:val="17"/>
-        </w:rPr>
-        <w:t>S2/Sumativa2_Validacion_Remuestreo.ipynb</w:t>
-      </w:r>
-      <w:r>
-        <w:rPr>
-          <w:rFonts w:asciiTheme="minorHAnsi" w:hAnsiTheme="minorHAnsi" w:cstheme="minorHAnsi"/>
-        </w:rPr>
-        <w:t xml:space="preserve">, que corre de principio a fin sin errores en poco más de un minuto y deja sus salidas en </w:t>
-      </w:r>
-      <w:r>
-        <w:rPr>
-          <w:rFonts w:asciiTheme="minorHAnsi" w:eastAsia="Consolas" w:hAnsiTheme="minorHAnsi" w:cstheme="minorHAnsi"/>
-          <w:sz w:val="17"/>
-          <w:szCs w:val="17"/>
-        </w:rPr>
-        <w:t>S2/resultados/</w:t>
-      </w:r>
-      <w:r>
-        <w:rPr>
-          <w:rFonts w:asciiTheme="minorHAnsi" w:hAnsiTheme="minorHAnsi" w:cstheme="minorHAnsi"/>
-        </w:rPr>
-        <w:t xml:space="preserve">. Cada procedimiento emplea 10.000 repeticiones y la semilla fijada en 42, de modo que los resultados son reproducibles hasta la última cifra. El repositorio contiene las carpetas </w:t>
-      </w:r>
-      <w:r>
-        <w:rPr>
-          <w:rFonts w:asciiTheme="minorHAnsi" w:eastAsia="Consolas" w:hAnsiTheme="minorHAnsi" w:cstheme="minorHAnsi"/>
-          <w:sz w:val="17"/>
-          <w:szCs w:val="17"/>
-        </w:rPr>
-        <w:t>S1</w:t>
-      </w:r>
-      <w:r>
-        <w:rPr>
-          <w:rFonts w:asciiTheme="minorHAnsi" w:hAnsiTheme="minorHAnsi" w:cstheme="minorHAnsi"/>
-        </w:rPr>
-        <w:t xml:space="preserve"> y </w:t>
-      </w:r>
-      <w:r>
-        <w:rPr>
-          <w:rFonts w:asciiTheme="minorHAnsi" w:eastAsia="Consolas" w:hAnsiTheme="minorHAnsi" w:cstheme="minorHAnsi"/>
-          <w:sz w:val="17"/>
-          <w:szCs w:val="17"/>
-        </w:rPr>
-        <w:t>S2</w:t>
-      </w:r>
-      <w:r>
-        <w:rPr>
-          <w:rFonts w:asciiTheme="minorHAnsi" w:hAnsiTheme="minorHAnsi" w:cstheme="minorHAnsi"/>
-        </w:rPr>
-        <w:t xml:space="preserve"> con los entregables de cada fase, el conjunto analítico versionado y los scripts que lo construyeron a partir de las bases del SIES.</w:t>
+      <w:bookmarkStart w:id="9" w:name="_Toc243059338"/>
+      <w:r>
+        <w:rPr>
+          <w:rFonts w:asciiTheme="minorHAnsi" w:hAnsiTheme="minorHAnsi" w:cstheme="minorHAnsi"/>
+        </w:rPr>
+        <w:t xml:space="preserve">El informe remite al cuaderno S2/Sumativa2_Validacion_Remuestreo.ipynb para reproducir las cifras y generar las salidas en S2/resultados/. Los procedimientos de </w:t>
+      </w:r>
+      <w:proofErr w:type="spellStart"/>
+      <w:r>
+        <w:rPr>
+          <w:rFonts w:asciiTheme="minorHAnsi" w:hAnsiTheme="minorHAnsi" w:cstheme="minorHAnsi"/>
+        </w:rPr>
+        <w:t>bootstrap</w:t>
+      </w:r>
+      <w:proofErr w:type="spellEnd"/>
+      <w:r>
+        <w:rPr>
+          <w:rFonts w:asciiTheme="minorHAnsi" w:hAnsiTheme="minorHAnsi" w:cstheme="minorHAnsi"/>
+        </w:rPr>
+        <w:t>, permutación y Monte Carlo utilizan 10.000 repeticiones y una semilla fijada en 42. El repositorio reúne las carpetas S1 y S2 con los entregables de cada etapa, el conjunto analítico versionado y los scripts utilizados para construirlo a partir de las bases del SIES. La semilla permite repetir los cálculos bajo las mismas condiciones de ejecución.</w:t>
       </w:r>
     </w:p>
     <w:p>
@@ -6330,9 +6558,9 @@
         <w:rPr>
           <w:rFonts w:asciiTheme="minorHAnsi" w:hAnsiTheme="minorHAnsi" w:cstheme="minorHAnsi"/>
           <w:color w:val="auto"/>
-        </w:rPr>
-      </w:pPr>
-      <w:bookmarkStart w:id="7" w:name="_Toc243059338"/>
+          <w:lang w:val="en-US"/>
+        </w:rPr>
+      </w:pPr>
       <w:r>
         <w:rPr>
           <w:rFonts w:asciiTheme="minorHAnsi" w:hAnsiTheme="minorHAnsi" w:cstheme="minorHAnsi"/>
@@ -6341,10 +6569,25 @@
           <w:color w:val="auto"/>
           <w:sz w:val="25"/>
           <w:szCs w:val="25"/>
-        </w:rPr>
-        <w:t>7. Bibliografía</w:t>
-      </w:r>
-      <w:bookmarkEnd w:id="7"/>
+          <w:lang w:val="en-US"/>
+        </w:rPr>
+        <w:t xml:space="preserve">7. </w:t>
+      </w:r>
+      <w:proofErr w:type="spellStart"/>
+      <w:r>
+        <w:rPr>
+          <w:rFonts w:asciiTheme="minorHAnsi" w:hAnsiTheme="minorHAnsi" w:cstheme="minorHAnsi"/>
+          <w:b/>
+          <w:bCs/>
+          <w:color w:val="auto"/>
+          <w:sz w:val="25"/>
+          <w:szCs w:val="25"/>
+          <w:lang w:val="en-US"/>
+        </w:rPr>
+        <w:t>Bibliografía</w:t>
+      </w:r>
+      <w:bookmarkEnd w:id="9"/>
+      <w:proofErr w:type="spellEnd"/>
     </w:p>
     <w:p>
       <w:pPr>
@@ -6390,11 +6633,33 @@
           <w:lang w:val="en-US"/>
         </w:rPr>
       </w:pPr>
-      <w:r>
-        <w:rPr>
-          <w:rFonts w:asciiTheme="minorHAnsi" w:hAnsiTheme="minorHAnsi" w:cstheme="minorHAnsi"/>
-        </w:rPr>
-        <w:t xml:space="preserve">Efron, B. y Tibshirani, R. J. (1993). </w:t>
+      <w:proofErr w:type="spellStart"/>
+      <w:r>
+        <w:rPr>
+          <w:rFonts w:asciiTheme="minorHAnsi" w:hAnsiTheme="minorHAnsi" w:cstheme="minorHAnsi"/>
+        </w:rPr>
+        <w:t>Efron</w:t>
+      </w:r>
+      <w:proofErr w:type="spellEnd"/>
+      <w:r>
+        <w:rPr>
+          <w:rFonts w:asciiTheme="minorHAnsi" w:hAnsiTheme="minorHAnsi" w:cstheme="minorHAnsi"/>
+        </w:rPr>
+        <w:t xml:space="preserve">, B. y </w:t>
+      </w:r>
+      <w:proofErr w:type="spellStart"/>
+      <w:r>
+        <w:rPr>
+          <w:rFonts w:asciiTheme="minorHAnsi" w:hAnsiTheme="minorHAnsi" w:cstheme="minorHAnsi"/>
+        </w:rPr>
+        <w:t>Tibshirani</w:t>
+      </w:r>
+      <w:proofErr w:type="spellEnd"/>
+      <w:r>
+        <w:rPr>
+          <w:rFonts w:asciiTheme="minorHAnsi" w:hAnsiTheme="minorHAnsi" w:cstheme="minorHAnsi"/>
+        </w:rPr>
+        <w:t xml:space="preserve">, R. J. (1993). </w:t>
       </w:r>
       <w:r>
         <w:rPr>
@@ -6536,11 +6801,75 @@
           <w:lang w:val="en-US"/>
         </w:rPr>
       </w:pPr>
-      <w:r>
-        <w:rPr>
-          <w:rFonts w:asciiTheme="minorHAnsi" w:hAnsiTheme="minorHAnsi" w:cstheme="minorHAnsi"/>
-        </w:rPr>
-        <w:t xml:space="preserve">Virtanen, P., Gommers, R., Oliphant, T. E., Haberland, M., Reddy, T., Cournapeau, D. et al. (2020). </w:t>
+      <w:proofErr w:type="spellStart"/>
+      <w:r>
+        <w:rPr>
+          <w:rFonts w:asciiTheme="minorHAnsi" w:hAnsiTheme="minorHAnsi" w:cstheme="minorHAnsi"/>
+        </w:rPr>
+        <w:t>Virtanen</w:t>
+      </w:r>
+      <w:proofErr w:type="spellEnd"/>
+      <w:r>
+        <w:rPr>
+          <w:rFonts w:asciiTheme="minorHAnsi" w:hAnsiTheme="minorHAnsi" w:cstheme="minorHAnsi"/>
+        </w:rPr>
+        <w:t xml:space="preserve">, P., </w:t>
+      </w:r>
+      <w:proofErr w:type="spellStart"/>
+      <w:r>
+        <w:rPr>
+          <w:rFonts w:asciiTheme="minorHAnsi" w:hAnsiTheme="minorHAnsi" w:cstheme="minorHAnsi"/>
+        </w:rPr>
+        <w:t>Gommers</w:t>
+      </w:r>
+      <w:proofErr w:type="spellEnd"/>
+      <w:r>
+        <w:rPr>
+          <w:rFonts w:asciiTheme="minorHAnsi" w:hAnsiTheme="minorHAnsi" w:cstheme="minorHAnsi"/>
+        </w:rPr>
+        <w:t xml:space="preserve">, R., </w:t>
+      </w:r>
+      <w:proofErr w:type="spellStart"/>
+      <w:r>
+        <w:rPr>
+          <w:rFonts w:asciiTheme="minorHAnsi" w:hAnsiTheme="minorHAnsi" w:cstheme="minorHAnsi"/>
+        </w:rPr>
+        <w:t>Oliphant</w:t>
+      </w:r>
+      <w:proofErr w:type="spellEnd"/>
+      <w:r>
+        <w:rPr>
+          <w:rFonts w:asciiTheme="minorHAnsi" w:hAnsiTheme="minorHAnsi" w:cstheme="minorHAnsi"/>
+        </w:rPr>
+        <w:t xml:space="preserve">, T. E., </w:t>
+      </w:r>
+      <w:proofErr w:type="spellStart"/>
+      <w:r>
+        <w:rPr>
+          <w:rFonts w:asciiTheme="minorHAnsi" w:hAnsiTheme="minorHAnsi" w:cstheme="minorHAnsi"/>
+        </w:rPr>
+        <w:t>Haberland</w:t>
+      </w:r>
+      <w:proofErr w:type="spellEnd"/>
+      <w:r>
+        <w:rPr>
+          <w:rFonts w:asciiTheme="minorHAnsi" w:hAnsiTheme="minorHAnsi" w:cstheme="minorHAnsi"/>
+        </w:rPr>
+        <w:t xml:space="preserve">, M., Reddy, T., </w:t>
+      </w:r>
+      <w:proofErr w:type="spellStart"/>
+      <w:r>
+        <w:rPr>
+          <w:rFonts w:asciiTheme="minorHAnsi" w:hAnsiTheme="minorHAnsi" w:cstheme="minorHAnsi"/>
+        </w:rPr>
+        <w:t>Cournapeau</w:t>
+      </w:r>
+      <w:proofErr w:type="spellEnd"/>
+      <w:r>
+        <w:rPr>
+          <w:rFonts w:asciiTheme="minorHAnsi" w:hAnsiTheme="minorHAnsi" w:cstheme="minorHAnsi"/>
+        </w:rPr>
+        <w:t xml:space="preserve">, D. et al. (2020). </w:t>
       </w:r>
       <w:r>
         <w:rPr>

</xml_diff>